<commit_message>
Report v2: justified layout, checklist first, signed attendance figure
</commit_message>
<xml_diff>
--- a/assets/docs/cgct-model1-report.docx
+++ b/assets/docs/cgct-model1-report.docx
@@ -25,7 +25,7 @@
                 <w:noProof/>
               </w:rPr>
               <w:drawing>
-                <wp:inline distT="0" distB="0" distL="0" distR="0" wp14:anchorId="0FE69D4B" wp14:editId="1D2D1200">
+                <wp:inline distT="0" distB="0" distL="0" distR="0" wp14:anchorId="36D58C3A" wp14:editId="39716D34">
                   <wp:extent cx="2015999" cy="1066087"/>
                   <wp:effectExtent l="0" t="0" r="0" b="0"/>
                   <wp:docPr id="1" name="Picture 1"/>
@@ -75,7 +75,7 @@
                 <w:noProof/>
               </w:rPr>
               <w:drawing>
-                <wp:inline distT="0" distB="0" distL="0" distR="0" wp14:anchorId="651855FA" wp14:editId="71A738B3">
+                <wp:inline distT="0" distB="0" distL="0" distR="0" wp14:anchorId="4F773F74" wp14:editId="2CCA1DA2">
                   <wp:extent cx="1944000" cy="802043"/>
                   <wp:effectExtent l="0" t="0" r="0" b="0"/>
                   <wp:docPr id="2" name="Picture 2"/>
@@ -124,7 +124,7 @@
           <w:noProof/>
         </w:rPr>
         <w:drawing>
-          <wp:inline distT="0" distB="0" distL="0" distR="0" wp14:anchorId="373725E9" wp14:editId="59B63149">
+          <wp:inline distT="0" distB="0" distL="0" distR="0" wp14:anchorId="60DF972E" wp14:editId="7CB7BCEA">
             <wp:extent cx="5688000" cy="1279463"/>
             <wp:effectExtent l="0" t="0" r="0" b="0"/>
             <wp:docPr id="3" name="Picture 3"/>
@@ -384,6 +384,254 @@
     </w:p>
     <w:p>
       <w:pPr>
+        <w:pStyle w:val="Heading1"/>
+      </w:pPr>
+      <w:bookmarkStart w:id="0" w:name="_Toc243489801"/>
+      <w:r>
+        <w:lastRenderedPageBreak/>
+        <w:t>COMPLETED CGCT MODEL 1 CHECKLIST</w:t>
+      </w:r>
+      <w:bookmarkEnd w:id="0"/>
+    </w:p>
+    <w:tbl>
+      <w:tblPr>
+        <w:tblStyle w:val="TableGrid"/>
+        <w:tblW w:w="0" w:type="auto"/>
+        <w:jc w:val="center"/>
+        <w:tblLayout w:type="fixed"/>
+        <w:tblLook w:val="04A0" w:firstRow="1" w:lastRow="0" w:firstColumn="1" w:lastColumn="0" w:noHBand="0" w:noVBand="1"/>
+      </w:tblPr>
+      <w:tblGrid>
+        <w:gridCol w:w="2608"/>
+        <w:gridCol w:w="2494"/>
+        <w:gridCol w:w="4082"/>
+      </w:tblGrid>
+      <w:tr>
+        <w:trPr>
+          <w:jc w:val="center"/>
+        </w:trPr>
+        <w:tc>
+          <w:tcPr>
+            <w:tcW w:w="2608" w:type="dxa"/>
+            <w:shd w:val="clear" w:color="auto" w:fill="EFE9F7"/>
+          </w:tcPr>
+          <w:p>
+            <w:pPr>
+              <w:spacing w:after="40"/>
+            </w:pPr>
+            <w:r>
+              <w:rPr>
+                <w:b/>
+                <w:sz w:val="18"/>
+              </w:rPr>
+              <w:t>Checklist item</w:t>
+            </w:r>
+          </w:p>
+        </w:tc>
+        <w:tc>
+          <w:tcPr>
+            <w:tcW w:w="2494" w:type="dxa"/>
+            <w:shd w:val="clear" w:color="auto" w:fill="EFE9F7"/>
+          </w:tcPr>
+          <w:p>
+            <w:pPr>
+              <w:spacing w:after="40"/>
+            </w:pPr>
+            <w:r>
+              <w:rPr>
+                <w:b/>
+                <w:sz w:val="18"/>
+              </w:rPr>
+              <w:t>Requirement</w:t>
+            </w:r>
+          </w:p>
+        </w:tc>
+        <w:tc>
+          <w:tcPr>
+            <w:tcW w:w="4082" w:type="dxa"/>
+            <w:shd w:val="clear" w:color="auto" w:fill="EFE9F7"/>
+          </w:tcPr>
+          <w:p>
+            <w:pPr>
+              <w:spacing w:after="40"/>
+            </w:pPr>
+            <w:r>
+              <w:rPr>
+                <w:b/>
+                <w:sz w:val="18"/>
+              </w:rPr>
+              <w:t>Evidence / status</w:t>
+            </w:r>
+          </w:p>
+        </w:tc>
+      </w:tr>
+      <w:tr>
+        <w:trPr>
+          <w:jc w:val="center"/>
+        </w:trPr>
+        <w:tc>
+          <w:tcPr>
+            <w:tcW w:w="2608" w:type="dxa"/>
+          </w:tcPr>
+          <w:p>
+            <w:pPr>
+              <w:spacing w:after="40"/>
+            </w:pPr>
+            <w:r>
+              <w:rPr>
+                <w:sz w:val="18"/>
+              </w:rPr>
+              <w:t>(a) Scheme of work that includes the developed topics</w:t>
+            </w:r>
+          </w:p>
+        </w:tc>
+        <w:tc>
+          <w:tcPr>
+            <w:tcW w:w="2494" w:type="dxa"/>
+          </w:tcPr>
+          <w:p>
+            <w:pPr>
+              <w:spacing w:after="40"/>
+            </w:pPr>
+            <w:r>
+              <w:rPr>
+                <w:sz w:val="18"/>
+              </w:rPr>
+              <w:t>Updated scheme of work showing the topics developed collaboratively</w:t>
+            </w:r>
+          </w:p>
+        </w:tc>
+        <w:tc>
+          <w:tcPr>
+            <w:tcW w:w="4082" w:type="dxa"/>
+          </w:tcPr>
+          <w:p>
+            <w:pPr>
+              <w:spacing w:after="40"/>
+            </w:pPr>
+            <w:r>
+              <w:rPr>
+                <w:sz w:val="18"/>
+              </w:rPr>
+              <w:t>PROVIDED — tuned teaching plan with the Developed Content (CGCT Model 1) column and collaboration block (companion docx/pdf; web app: Section 7.4). Status: complete.</w:t>
+            </w:r>
+          </w:p>
+        </w:tc>
+      </w:tr>
+      <w:tr>
+        <w:trPr>
+          <w:jc w:val="center"/>
+        </w:trPr>
+        <w:tc>
+          <w:tcPr>
+            <w:tcW w:w="2608" w:type="dxa"/>
+          </w:tcPr>
+          <w:p>
+            <w:pPr>
+              <w:spacing w:after="40"/>
+            </w:pPr>
+            <w:r>
+              <w:rPr>
+                <w:sz w:val="18"/>
+              </w:rPr>
+              <w:t>(b) Link / screenshots of the developed content</w:t>
+            </w:r>
+          </w:p>
+        </w:tc>
+        <w:tc>
+          <w:tcPr>
+            <w:tcW w:w="2494" w:type="dxa"/>
+          </w:tcPr>
+          <w:p>
+            <w:pPr>
+              <w:spacing w:after="40"/>
+            </w:pPr>
+            <w:r>
+              <w:rPr>
+                <w:sz w:val="18"/>
+              </w:rPr>
+              <w:t>Access link and screenshots of the developed content</w:t>
+            </w:r>
+          </w:p>
+        </w:tc>
+        <w:tc>
+          <w:tcPr>
+            <w:tcW w:w="4082" w:type="dxa"/>
+          </w:tcPr>
+          <w:p>
+            <w:pPr>
+              <w:spacing w:after="40"/>
+            </w:pPr>
+            <w:r>
+              <w:rPr>
+                <w:sz w:val="18"/>
+              </w:rPr>
+              <w:t>PROVIDED — live portal and repository links (Sections 4.3, 7.4); screenshots: Figures 1–11 (Appendix A). Status: complete.</w:t>
+            </w:r>
+          </w:p>
+        </w:tc>
+      </w:tr>
+      <w:tr>
+        <w:trPr>
+          <w:jc w:val="center"/>
+        </w:trPr>
+        <w:tc>
+          <w:tcPr>
+            <w:tcW w:w="2608" w:type="dxa"/>
+          </w:tcPr>
+          <w:p>
+            <w:pPr>
+              <w:spacing w:after="40"/>
+            </w:pPr>
+            <w:r>
+              <w:rPr>
+                <w:sz w:val="18"/>
+              </w:rPr>
+              <w:t>(c) Evidence of session(s) conducted with students and content</w:t>
+            </w:r>
+          </w:p>
+        </w:tc>
+        <w:tc>
+          <w:tcPr>
+            <w:tcW w:w="2494" w:type="dxa"/>
+          </w:tcPr>
+          <w:p>
+            <w:pPr>
+              <w:spacing w:after="40"/>
+            </w:pPr>
+            <w:r>
+              <w:rPr>
+                <w:sz w:val="18"/>
+              </w:rPr>
+              <w:t>Evidence of sessions conducted involving students and the developed content (e.g., photographs/screenshots)</w:t>
+            </w:r>
+          </w:p>
+        </w:tc>
+        <w:tc>
+          <w:tcPr>
+            <w:tcW w:w="4082" w:type="dxa"/>
+          </w:tcPr>
+          <w:p>
+            <w:pPr>
+              <w:spacing w:after="40"/>
+            </w:pPr>
+            <w:r>
+              <w:rPr>
+                <w:sz w:val="18"/>
+              </w:rPr>
+              <w:t>PROVIDED — student session with content (Figure 3), class roster (Figure 6), submissions with scores and attendance (Figure 7), attendance e-signature (Figure 4) and signed attendance record (Figure 9). Status: complete.</w:t>
+            </w:r>
+          </w:p>
+        </w:tc>
+      </w:tr>
+    </w:tbl>
+    <w:p>
+      <w:r>
+        <w:br w:type="page"/>
+      </w:r>
+    </w:p>
+    <w:p>
+      <w:pPr>
         <w:spacing w:after="200"/>
       </w:pPr>
       <w:r>
@@ -415,12 +663,80 @@
       <w:r>
         <w:fldChar w:fldCharType="separate"/>
       </w:r>
-      <w:hyperlink w:anchor="_Toc242697020" w:history="1">
+      <w:hyperlink w:anchor="_Toc243489801" w:history="1">
         <w:r>
           <w:rPr>
             <w:rStyle w:val="Hyperlink"/>
             <w:noProof/>
           </w:rPr>
+          <w:t>COMPLETED CGCT MODEL 1 CHECKLIST</w:t>
+        </w:r>
+        <w:r>
+          <w:rPr>
+            <w:noProof/>
+            <w:webHidden/>
+          </w:rPr>
+          <w:tab/>
+        </w:r>
+        <w:r>
+          <w:rPr>
+            <w:noProof/>
+            <w:webHidden/>
+          </w:rPr>
+          <w:fldChar w:fldCharType="begin"/>
+        </w:r>
+        <w:r>
+          <w:rPr>
+            <w:noProof/>
+            <w:webHidden/>
+          </w:rPr>
+          <w:instrText xml:space="preserve"> PAGEREF _Toc243489801 \h </w:instrText>
+        </w:r>
+        <w:r>
+          <w:rPr>
+            <w:noProof/>
+            <w:webHidden/>
+          </w:rPr>
+        </w:r>
+        <w:r>
+          <w:rPr>
+            <w:noProof/>
+            <w:webHidden/>
+          </w:rPr>
+          <w:fldChar w:fldCharType="separate"/>
+        </w:r>
+        <w:r>
+          <w:rPr>
+            <w:noProof/>
+            <w:webHidden/>
+          </w:rPr>
+          <w:t>2</w:t>
+        </w:r>
+        <w:r>
+          <w:rPr>
+            <w:noProof/>
+            <w:webHidden/>
+          </w:rPr>
+          <w:fldChar w:fldCharType="end"/>
+        </w:r>
+      </w:hyperlink>
+    </w:p>
+    <w:p>
+      <w:pPr>
+        <w:pStyle w:val="TOC1"/>
+        <w:tabs>
+          <w:tab w:val="right" w:leader="dot" w:pos="9062"/>
+        </w:tabs>
+        <w:rPr>
+          <w:noProof/>
+        </w:rPr>
+      </w:pPr>
+      <w:hyperlink w:anchor="_Toc243489802" w:history="1">
+        <w:r>
+          <w:rPr>
+            <w:rStyle w:val="Hyperlink"/>
+            <w:noProof/>
+          </w:rPr>
           <w:t>1. INTRODUCTION</w:t>
         </w:r>
         <w:r>
@@ -442,7 +758,7 @@
             <w:noProof/>
             <w:webHidden/>
           </w:rPr>
-          <w:instrText xml:space="preserve"> PAGEREF _Toc242697020 \h </w:instrText>
+          <w:instrText xml:space="preserve"> PAGEREF _Toc243489802 \h </w:instrText>
         </w:r>
         <w:r>
           <w:rPr>
@@ -462,7 +778,7 @@
             <w:noProof/>
             <w:webHidden/>
           </w:rPr>
-          <w:t>3</w:t>
+          <w:t>4</w:t>
         </w:r>
         <w:r>
           <w:rPr>
@@ -483,7 +799,7 @@
           <w:noProof/>
         </w:rPr>
       </w:pPr>
-      <w:hyperlink w:anchor="_Toc242697021" w:history="1">
+      <w:hyperlink w:anchor="_Toc243489803" w:history="1">
         <w:r>
           <w:rPr>
             <w:rStyle w:val="Hyperlink"/>
@@ -510,7 +826,7 @@
             <w:noProof/>
             <w:webHidden/>
           </w:rPr>
-          <w:instrText xml:space="preserve"> PAGEREF _Toc242697021 \h </w:instrText>
+          <w:instrText xml:space="preserve"> PAGEREF _Toc243489803 \h </w:instrText>
         </w:r>
         <w:r>
           <w:rPr>
@@ -530,7 +846,7 @@
             <w:noProof/>
             <w:webHidden/>
           </w:rPr>
-          <w:t>3</w:t>
+          <w:t>4</w:t>
         </w:r>
         <w:r>
           <w:rPr>
@@ -551,7 +867,7 @@
           <w:noProof/>
         </w:rPr>
       </w:pPr>
-      <w:hyperlink w:anchor="_Toc242697022" w:history="1">
+      <w:hyperlink w:anchor="_Toc243489804" w:history="1">
         <w:r>
           <w:rPr>
             <w:rStyle w:val="Hyperlink"/>
@@ -578,7 +894,7 @@
             <w:noProof/>
             <w:webHidden/>
           </w:rPr>
-          <w:instrText xml:space="preserve"> PAGEREF _Toc242697022 \h </w:instrText>
+          <w:instrText xml:space="preserve"> PAGEREF _Toc243489804 \h </w:instrText>
         </w:r>
         <w:r>
           <w:rPr>
@@ -598,7 +914,7 @@
             <w:noProof/>
             <w:webHidden/>
           </w:rPr>
-          <w:t>3</w:t>
+          <w:t>4</w:t>
         </w:r>
         <w:r>
           <w:rPr>
@@ -619,7 +935,7 @@
           <w:noProof/>
         </w:rPr>
       </w:pPr>
-      <w:hyperlink w:anchor="_Toc242697023" w:history="1">
+      <w:hyperlink w:anchor="_Toc243489805" w:history="1">
         <w:r>
           <w:rPr>
             <w:rStyle w:val="Hyperlink"/>
@@ -646,7 +962,7 @@
             <w:noProof/>
             <w:webHidden/>
           </w:rPr>
-          <w:instrText xml:space="preserve"> PAGEREF _Toc242697023 \h </w:instrText>
+          <w:instrText xml:space="preserve"> PAGEREF _Toc243489805 \h </w:instrText>
         </w:r>
         <w:r>
           <w:rPr>
@@ -666,7 +982,7 @@
             <w:noProof/>
             <w:webHidden/>
           </w:rPr>
-          <w:t>3</w:t>
+          <w:t>4</w:t>
         </w:r>
         <w:r>
           <w:rPr>
@@ -687,7 +1003,7 @@
           <w:noProof/>
         </w:rPr>
       </w:pPr>
-      <w:hyperlink w:anchor="_Toc242697024" w:history="1">
+      <w:hyperlink w:anchor="_Toc243489806" w:history="1">
         <w:r>
           <w:rPr>
             <w:rStyle w:val="Hyperlink"/>
@@ -714,7 +1030,7 @@
             <w:noProof/>
             <w:webHidden/>
           </w:rPr>
-          <w:instrText xml:space="preserve"> PAGEREF _Toc242697024 \h </w:instrText>
+          <w:instrText xml:space="preserve"> PAGEREF _Toc243489806 \h </w:instrText>
         </w:r>
         <w:r>
           <w:rPr>
@@ -734,7 +1050,7 @@
             <w:noProof/>
             <w:webHidden/>
           </w:rPr>
-          <w:t>3</w:t>
+          <w:t>4</w:t>
         </w:r>
         <w:r>
           <w:rPr>
@@ -755,7 +1071,7 @@
           <w:noProof/>
         </w:rPr>
       </w:pPr>
-      <w:hyperlink w:anchor="_Toc242697025" w:history="1">
+      <w:hyperlink w:anchor="_Toc243489807" w:history="1">
         <w:r>
           <w:rPr>
             <w:rStyle w:val="Hyperlink"/>
@@ -782,7 +1098,7 @@
             <w:noProof/>
             <w:webHidden/>
           </w:rPr>
-          <w:instrText xml:space="preserve"> PAGEREF _Toc242697025 \h </w:instrText>
+          <w:instrText xml:space="preserve"> PAGEREF _Toc243489807 \h </w:instrText>
         </w:r>
         <w:r>
           <w:rPr>
@@ -802,7 +1118,7 @@
             <w:noProof/>
             <w:webHidden/>
           </w:rPr>
-          <w:t>3</w:t>
+          <w:t>4</w:t>
         </w:r>
         <w:r>
           <w:rPr>
@@ -823,7 +1139,7 @@
           <w:noProof/>
         </w:rPr>
       </w:pPr>
-      <w:hyperlink w:anchor="_Toc242697026" w:history="1">
+      <w:hyperlink w:anchor="_Toc243489808" w:history="1">
         <w:r>
           <w:rPr>
             <w:rStyle w:val="Hyperlink"/>
@@ -850,7 +1166,7 @@
             <w:noProof/>
             <w:webHidden/>
           </w:rPr>
-          <w:instrText xml:space="preserve"> PAGEREF _Toc242697026 \h </w:instrText>
+          <w:instrText xml:space="preserve"> PAGEREF _Toc243489808 \h </w:instrText>
         </w:r>
         <w:r>
           <w:rPr>
@@ -870,7 +1186,7 @@
             <w:noProof/>
             <w:webHidden/>
           </w:rPr>
-          <w:t>4</w:t>
+          <w:t>5</w:t>
         </w:r>
         <w:r>
           <w:rPr>
@@ -891,7 +1207,7 @@
           <w:noProof/>
         </w:rPr>
       </w:pPr>
-      <w:hyperlink w:anchor="_Toc242697027" w:history="1">
+      <w:hyperlink w:anchor="_Toc243489809" w:history="1">
         <w:r>
           <w:rPr>
             <w:rStyle w:val="Hyperlink"/>
@@ -918,7 +1234,7 @@
             <w:noProof/>
             <w:webHidden/>
           </w:rPr>
-          <w:instrText xml:space="preserve"> PAGEREF _Toc242697027 \h </w:instrText>
+          <w:instrText xml:space="preserve"> PAGEREF _Toc243489809 \h </w:instrText>
         </w:r>
         <w:r>
           <w:rPr>
@@ -938,7 +1254,7 @@
             <w:noProof/>
             <w:webHidden/>
           </w:rPr>
-          <w:t>4</w:t>
+          <w:t>5</w:t>
         </w:r>
         <w:r>
           <w:rPr>
@@ -959,7 +1275,7 @@
           <w:noProof/>
         </w:rPr>
       </w:pPr>
-      <w:hyperlink w:anchor="_Toc242697028" w:history="1">
+      <w:hyperlink w:anchor="_Toc243489810" w:history="1">
         <w:r>
           <w:rPr>
             <w:rStyle w:val="Hyperlink"/>
@@ -986,7 +1302,7 @@
             <w:noProof/>
             <w:webHidden/>
           </w:rPr>
-          <w:instrText xml:space="preserve"> PAGEREF _Toc242697028 \h </w:instrText>
+          <w:instrText xml:space="preserve"> PAGEREF _Toc243489810 \h </w:instrText>
         </w:r>
         <w:r>
           <w:rPr>
@@ -1006,7 +1322,7 @@
             <w:noProof/>
             <w:webHidden/>
           </w:rPr>
-          <w:t>4</w:t>
+          <w:t>5</w:t>
         </w:r>
         <w:r>
           <w:rPr>
@@ -1027,7 +1343,7 @@
           <w:noProof/>
         </w:rPr>
       </w:pPr>
-      <w:hyperlink w:anchor="_Toc242697029" w:history="1">
+      <w:hyperlink w:anchor="_Toc243489811" w:history="1">
         <w:r>
           <w:rPr>
             <w:rStyle w:val="Hyperlink"/>
@@ -1054,7 +1370,7 @@
             <w:noProof/>
             <w:webHidden/>
           </w:rPr>
-          <w:instrText xml:space="preserve"> PAGEREF _Toc242697029 \h </w:instrText>
+          <w:instrText xml:space="preserve"> PAGEREF _Toc243489811 \h </w:instrText>
         </w:r>
         <w:r>
           <w:rPr>
@@ -1074,7 +1390,7 @@
             <w:noProof/>
             <w:webHidden/>
           </w:rPr>
-          <w:t>5</w:t>
+          <w:t>6</w:t>
         </w:r>
         <w:r>
           <w:rPr>
@@ -1095,7 +1411,7 @@
           <w:noProof/>
         </w:rPr>
       </w:pPr>
-      <w:hyperlink w:anchor="_Toc242697030" w:history="1">
+      <w:hyperlink w:anchor="_Toc243489812" w:history="1">
         <w:r>
           <w:rPr>
             <w:rStyle w:val="Hyperlink"/>
@@ -1122,7 +1438,7 @@
             <w:noProof/>
             <w:webHidden/>
           </w:rPr>
-          <w:instrText xml:space="preserve"> PAGEREF _Toc242697030 \h </w:instrText>
+          <w:instrText xml:space="preserve"> PAGEREF _Toc243489812 \h </w:instrText>
         </w:r>
         <w:r>
           <w:rPr>
@@ -1142,7 +1458,7 @@
             <w:noProof/>
             <w:webHidden/>
           </w:rPr>
-          <w:t>5</w:t>
+          <w:t>6</w:t>
         </w:r>
         <w:r>
           <w:rPr>
@@ -1163,7 +1479,7 @@
           <w:noProof/>
         </w:rPr>
       </w:pPr>
-      <w:hyperlink w:anchor="_Toc242697031" w:history="1">
+      <w:hyperlink w:anchor="_Toc243489813" w:history="1">
         <w:r>
           <w:rPr>
             <w:rStyle w:val="Hyperlink"/>
@@ -1190,7 +1506,7 @@
             <w:noProof/>
             <w:webHidden/>
           </w:rPr>
-          <w:instrText xml:space="preserve"> PAGEREF _Toc242697031 \h </w:instrText>
+          <w:instrText xml:space="preserve"> PAGEREF _Toc243489813 \h </w:instrText>
         </w:r>
         <w:r>
           <w:rPr>
@@ -1210,7 +1526,7 @@
             <w:noProof/>
             <w:webHidden/>
           </w:rPr>
-          <w:t>5</w:t>
+          <w:t>6</w:t>
         </w:r>
         <w:r>
           <w:rPr>
@@ -1231,7 +1547,7 @@
           <w:noProof/>
         </w:rPr>
       </w:pPr>
-      <w:hyperlink w:anchor="_Toc242697032" w:history="1">
+      <w:hyperlink w:anchor="_Toc243489814" w:history="1">
         <w:r>
           <w:rPr>
             <w:rStyle w:val="Hyperlink"/>
@@ -1258,7 +1574,7 @@
             <w:noProof/>
             <w:webHidden/>
           </w:rPr>
-          <w:instrText xml:space="preserve"> PAGEREF _Toc242697032 \h </w:instrText>
+          <w:instrText xml:space="preserve"> PAGEREF _Toc243489814 \h </w:instrText>
         </w:r>
         <w:r>
           <w:rPr>
@@ -1278,7 +1594,7 @@
             <w:noProof/>
             <w:webHidden/>
           </w:rPr>
-          <w:t>6</w:t>
+          <w:t>7</w:t>
         </w:r>
         <w:r>
           <w:rPr>
@@ -1299,7 +1615,7 @@
           <w:noProof/>
         </w:rPr>
       </w:pPr>
-      <w:hyperlink w:anchor="_Toc242697033" w:history="1">
+      <w:hyperlink w:anchor="_Toc243489815" w:history="1">
         <w:r>
           <w:rPr>
             <w:rStyle w:val="Hyperlink"/>
@@ -1326,7 +1642,7 @@
             <w:noProof/>
             <w:webHidden/>
           </w:rPr>
-          <w:instrText xml:space="preserve"> PAGEREF _Toc242697033 \h </w:instrText>
+          <w:instrText xml:space="preserve"> PAGEREF _Toc243489815 \h </w:instrText>
         </w:r>
         <w:r>
           <w:rPr>
@@ -1346,7 +1662,7 @@
             <w:noProof/>
             <w:webHidden/>
           </w:rPr>
-          <w:t>6</w:t>
+          <w:t>7</w:t>
         </w:r>
         <w:r>
           <w:rPr>
@@ -1367,7 +1683,7 @@
           <w:noProof/>
         </w:rPr>
       </w:pPr>
-      <w:hyperlink w:anchor="_Toc242697034" w:history="1">
+      <w:hyperlink w:anchor="_Toc243489816" w:history="1">
         <w:r>
           <w:rPr>
             <w:rStyle w:val="Hyperlink"/>
@@ -1394,7 +1710,7 @@
             <w:noProof/>
             <w:webHidden/>
           </w:rPr>
-          <w:instrText xml:space="preserve"> PAGEREF _Toc242697034 \h </w:instrText>
+          <w:instrText xml:space="preserve"> PAGEREF _Toc243489816 \h </w:instrText>
         </w:r>
         <w:r>
           <w:rPr>
@@ -1414,7 +1730,7 @@
             <w:noProof/>
             <w:webHidden/>
           </w:rPr>
-          <w:t>6</w:t>
+          <w:t>7</w:t>
         </w:r>
         <w:r>
           <w:rPr>
@@ -1435,7 +1751,7 @@
           <w:noProof/>
         </w:rPr>
       </w:pPr>
-      <w:hyperlink w:anchor="_Toc242697035" w:history="1">
+      <w:hyperlink w:anchor="_Toc243489817" w:history="1">
         <w:r>
           <w:rPr>
             <w:rStyle w:val="Hyperlink"/>
@@ -1462,7 +1778,7 @@
             <w:noProof/>
             <w:webHidden/>
           </w:rPr>
-          <w:instrText xml:space="preserve"> PAGEREF _Toc242697035 \h </w:instrText>
+          <w:instrText xml:space="preserve"> PAGEREF _Toc243489817 \h </w:instrText>
         </w:r>
         <w:r>
           <w:rPr>
@@ -1482,7 +1798,7 @@
             <w:noProof/>
             <w:webHidden/>
           </w:rPr>
-          <w:t>6</w:t>
+          <w:t>7</w:t>
         </w:r>
         <w:r>
           <w:rPr>
@@ -1503,7 +1819,7 @@
           <w:noProof/>
         </w:rPr>
       </w:pPr>
-      <w:hyperlink w:anchor="_Toc242697036" w:history="1">
+      <w:hyperlink w:anchor="_Toc243489818" w:history="1">
         <w:r>
           <w:rPr>
             <w:rStyle w:val="Hyperlink"/>
@@ -1530,7 +1846,7 @@
             <w:noProof/>
             <w:webHidden/>
           </w:rPr>
-          <w:instrText xml:space="preserve"> PAGEREF _Toc242697036 \h </w:instrText>
+          <w:instrText xml:space="preserve"> PAGEREF _Toc243489818 \h </w:instrText>
         </w:r>
         <w:r>
           <w:rPr>
@@ -1550,7 +1866,7 @@
             <w:noProof/>
             <w:webHidden/>
           </w:rPr>
-          <w:t>6</w:t>
+          <w:t>7</w:t>
         </w:r>
         <w:r>
           <w:rPr>
@@ -1571,7 +1887,7 @@
           <w:noProof/>
         </w:rPr>
       </w:pPr>
-      <w:hyperlink w:anchor="_Toc242697037" w:history="1">
+      <w:hyperlink w:anchor="_Toc243489819" w:history="1">
         <w:r>
           <w:rPr>
             <w:rStyle w:val="Hyperlink"/>
@@ -1598,7 +1914,7 @@
             <w:noProof/>
             <w:webHidden/>
           </w:rPr>
-          <w:instrText xml:space="preserve"> PAGEREF _Toc242697037 \h </w:instrText>
+          <w:instrText xml:space="preserve"> PAGEREF _Toc243489819 \h </w:instrText>
         </w:r>
         <w:r>
           <w:rPr>
@@ -1618,7 +1934,7 @@
             <w:noProof/>
             <w:webHidden/>
           </w:rPr>
-          <w:t>7</w:t>
+          <w:t>8</w:t>
         </w:r>
         <w:r>
           <w:rPr>
@@ -1639,7 +1955,7 @@
           <w:noProof/>
         </w:rPr>
       </w:pPr>
-      <w:hyperlink w:anchor="_Toc242697038" w:history="1">
+      <w:hyperlink w:anchor="_Toc243489820" w:history="1">
         <w:r>
           <w:rPr>
             <w:rStyle w:val="Hyperlink"/>
@@ -1666,7 +1982,7 @@
             <w:noProof/>
             <w:webHidden/>
           </w:rPr>
-          <w:instrText xml:space="preserve"> PAGEREF _Toc242697038 \h </w:instrText>
+          <w:instrText xml:space="preserve"> PAGEREF _Toc243489820 \h </w:instrText>
         </w:r>
         <w:r>
           <w:rPr>
@@ -1686,7 +2002,7 @@
             <w:noProof/>
             <w:webHidden/>
           </w:rPr>
-          <w:t>7</w:t>
+          <w:t>8</w:t>
         </w:r>
         <w:r>
           <w:rPr>
@@ -1707,7 +2023,7 @@
           <w:noProof/>
         </w:rPr>
       </w:pPr>
-      <w:hyperlink w:anchor="_Toc242697039" w:history="1">
+      <w:hyperlink w:anchor="_Toc243489821" w:history="1">
         <w:r>
           <w:rPr>
             <w:rStyle w:val="Hyperlink"/>
@@ -1734,7 +2050,7 @@
             <w:noProof/>
             <w:webHidden/>
           </w:rPr>
-          <w:instrText xml:space="preserve"> PAGEREF _Toc242697039 \h </w:instrText>
+          <w:instrText xml:space="preserve"> PAGEREF _Toc243489821 \h </w:instrText>
         </w:r>
         <w:r>
           <w:rPr>
@@ -1754,7 +2070,7 @@
             <w:noProof/>
             <w:webHidden/>
           </w:rPr>
-          <w:t>7</w:t>
+          <w:t>8</w:t>
         </w:r>
         <w:r>
           <w:rPr>
@@ -1775,7 +2091,7 @@
           <w:noProof/>
         </w:rPr>
       </w:pPr>
-      <w:hyperlink w:anchor="_Toc242697040" w:history="1">
+      <w:hyperlink w:anchor="_Toc243489822" w:history="1">
         <w:r>
           <w:rPr>
             <w:rStyle w:val="Hyperlink"/>
@@ -1802,7 +2118,7 @@
             <w:noProof/>
             <w:webHidden/>
           </w:rPr>
-          <w:instrText xml:space="preserve"> PAGEREF _Toc242697040 \h </w:instrText>
+          <w:instrText xml:space="preserve"> PAGEREF _Toc243489822 \h </w:instrText>
         </w:r>
         <w:r>
           <w:rPr>
@@ -1822,7 +2138,7 @@
             <w:noProof/>
             <w:webHidden/>
           </w:rPr>
-          <w:t>7</w:t>
+          <w:t>8</w:t>
         </w:r>
         <w:r>
           <w:rPr>
@@ -1843,7 +2159,7 @@
           <w:noProof/>
         </w:rPr>
       </w:pPr>
-      <w:hyperlink w:anchor="_Toc242697041" w:history="1">
+      <w:hyperlink w:anchor="_Toc243489823" w:history="1">
         <w:r>
           <w:rPr>
             <w:rStyle w:val="Hyperlink"/>
@@ -1870,7 +2186,7 @@
             <w:noProof/>
             <w:webHidden/>
           </w:rPr>
-          <w:instrText xml:space="preserve"> PAGEREF _Toc242697041 \h </w:instrText>
+          <w:instrText xml:space="preserve"> PAGEREF _Toc243489823 \h </w:instrText>
         </w:r>
         <w:r>
           <w:rPr>
@@ -1890,7 +2206,7 @@
             <w:noProof/>
             <w:webHidden/>
           </w:rPr>
-          <w:t>7</w:t>
+          <w:t>8</w:t>
         </w:r>
         <w:r>
           <w:rPr>
@@ -1911,7 +2227,7 @@
           <w:noProof/>
         </w:rPr>
       </w:pPr>
-      <w:hyperlink w:anchor="_Toc242697042" w:history="1">
+      <w:hyperlink w:anchor="_Toc243489824" w:history="1">
         <w:r>
           <w:rPr>
             <w:rStyle w:val="Hyperlink"/>
@@ -1938,7 +2254,7 @@
             <w:noProof/>
             <w:webHidden/>
           </w:rPr>
-          <w:instrText xml:space="preserve"> PAGEREF _Toc242697042 \h </w:instrText>
+          <w:instrText xml:space="preserve"> PAGEREF _Toc243489824 \h </w:instrText>
         </w:r>
         <w:r>
           <w:rPr>
@@ -1958,7 +2274,7 @@
             <w:noProof/>
             <w:webHidden/>
           </w:rPr>
-          <w:t>7</w:t>
+          <w:t>8</w:t>
         </w:r>
         <w:r>
           <w:rPr>
@@ -1979,7 +2295,7 @@
           <w:noProof/>
         </w:rPr>
       </w:pPr>
-      <w:hyperlink w:anchor="_Toc242697043" w:history="1">
+      <w:hyperlink w:anchor="_Toc243489825" w:history="1">
         <w:r>
           <w:rPr>
             <w:rStyle w:val="Hyperlink"/>
@@ -2006,7 +2322,7 @@
             <w:noProof/>
             <w:webHidden/>
           </w:rPr>
-          <w:instrText xml:space="preserve"> PAGEREF _Toc242697043 \h </w:instrText>
+          <w:instrText xml:space="preserve"> PAGEREF _Toc243489825 \h </w:instrText>
         </w:r>
         <w:r>
           <w:rPr>
@@ -2026,7 +2342,7 @@
             <w:noProof/>
             <w:webHidden/>
           </w:rPr>
-          <w:t>7</w:t>
+          <w:t>8</w:t>
         </w:r>
         <w:r>
           <w:rPr>
@@ -2047,7 +2363,7 @@
           <w:noProof/>
         </w:rPr>
       </w:pPr>
-      <w:hyperlink w:anchor="_Toc242697044" w:history="1">
+      <w:hyperlink w:anchor="_Toc243489826" w:history="1">
         <w:r>
           <w:rPr>
             <w:rStyle w:val="Hyperlink"/>
@@ -2074,7 +2390,7 @@
             <w:noProof/>
             <w:webHidden/>
           </w:rPr>
-          <w:instrText xml:space="preserve"> PAGEREF _Toc242697044 \h </w:instrText>
+          <w:instrText xml:space="preserve"> PAGEREF _Toc243489826 \h </w:instrText>
         </w:r>
         <w:r>
           <w:rPr>
@@ -2094,7 +2410,7 @@
             <w:noProof/>
             <w:webHidden/>
           </w:rPr>
-          <w:t>8</w:t>
+          <w:t>9</w:t>
         </w:r>
         <w:r>
           <w:rPr>
@@ -2115,7 +2431,7 @@
           <w:noProof/>
         </w:rPr>
       </w:pPr>
-      <w:hyperlink w:anchor="_Toc242697045" w:history="1">
+      <w:hyperlink w:anchor="_Toc243489827" w:history="1">
         <w:r>
           <w:rPr>
             <w:rStyle w:val="Hyperlink"/>
@@ -2142,7 +2458,7 @@
             <w:noProof/>
             <w:webHidden/>
           </w:rPr>
-          <w:instrText xml:space="preserve"> PAGEREF _Toc242697045 \h </w:instrText>
+          <w:instrText xml:space="preserve"> PAGEREF _Toc243489827 \h </w:instrText>
         </w:r>
         <w:r>
           <w:rPr>
@@ -2162,7 +2478,7 @@
             <w:noProof/>
             <w:webHidden/>
           </w:rPr>
-          <w:t>8</w:t>
+          <w:t>9</w:t>
         </w:r>
         <w:r>
           <w:rPr>
@@ -2183,13 +2499,13 @@
           <w:noProof/>
         </w:rPr>
       </w:pPr>
-      <w:hyperlink w:anchor="_Toc242697046" w:history="1">
+      <w:hyperlink w:anchor="_Toc243489828" w:history="1">
         <w:r>
           <w:rPr>
             <w:rStyle w:val="Hyperlink"/>
             <w:noProof/>
           </w:rPr>
-          <w:t>APPENDIX A — COMPLETED CGCT MODEL 1 CHECKLIST</w:t>
+          <w:t>APPENDIX A — EVIDENCE: SCREEN CAPTURES</w:t>
         </w:r>
         <w:r>
           <w:rPr>
@@ -2210,7 +2526,7 @@
             <w:noProof/>
             <w:webHidden/>
           </w:rPr>
-          <w:instrText xml:space="preserve"> PAGEREF _Toc242697046 \h </w:instrText>
+          <w:instrText xml:space="preserve"> PAGEREF _Toc243489828 \h </w:instrText>
         </w:r>
         <w:r>
           <w:rPr>
@@ -2230,7 +2546,7 @@
             <w:noProof/>
             <w:webHidden/>
           </w:rPr>
-          <w:t>9</w:t>
+          <w:t>10</w:t>
         </w:r>
         <w:r>
           <w:rPr>
@@ -2251,13 +2567,13 @@
           <w:noProof/>
         </w:rPr>
       </w:pPr>
-      <w:hyperlink w:anchor="_Toc242697047" w:history="1">
+      <w:hyperlink w:anchor="_Toc243489829" w:history="1">
         <w:r>
           <w:rPr>
             <w:rStyle w:val="Hyperlink"/>
             <w:noProof/>
           </w:rPr>
-          <w:t>APPENDIX B — EVIDENCE: SCREEN CAPTURES</w:t>
+          <w:t>APPENDIX B — INDUSTRY PANEL CURRICULUM VITAE</w:t>
         </w:r>
         <w:r>
           <w:rPr>
@@ -2278,75 +2594,7 @@
             <w:noProof/>
             <w:webHidden/>
           </w:rPr>
-          <w:instrText xml:space="preserve"> PAGEREF _Toc242697047 \h </w:instrText>
-        </w:r>
-        <w:r>
-          <w:rPr>
-            <w:noProof/>
-            <w:webHidden/>
-          </w:rPr>
-        </w:r>
-        <w:r>
-          <w:rPr>
-            <w:noProof/>
-            <w:webHidden/>
-          </w:rPr>
-          <w:fldChar w:fldCharType="separate"/>
-        </w:r>
-        <w:r>
-          <w:rPr>
-            <w:noProof/>
-            <w:webHidden/>
-          </w:rPr>
-          <w:t>10</w:t>
-        </w:r>
-        <w:r>
-          <w:rPr>
-            <w:noProof/>
-            <w:webHidden/>
-          </w:rPr>
-          <w:fldChar w:fldCharType="end"/>
-        </w:r>
-      </w:hyperlink>
-    </w:p>
-    <w:p>
-      <w:pPr>
-        <w:pStyle w:val="TOC1"/>
-        <w:tabs>
-          <w:tab w:val="right" w:leader="dot" w:pos="9062"/>
-        </w:tabs>
-        <w:rPr>
-          <w:noProof/>
-        </w:rPr>
-      </w:pPr>
-      <w:hyperlink w:anchor="_Toc242697048" w:history="1">
-        <w:r>
-          <w:rPr>
-            <w:rStyle w:val="Hyperlink"/>
-            <w:noProof/>
-          </w:rPr>
-          <w:t>APPENDIX C — INDUSTRY PANEL CURRICULUM VITAE</w:t>
-        </w:r>
-        <w:r>
-          <w:rPr>
-            <w:noProof/>
-            <w:webHidden/>
-          </w:rPr>
-          <w:tab/>
-        </w:r>
-        <w:r>
-          <w:rPr>
-            <w:noProof/>
-            <w:webHidden/>
-          </w:rPr>
-          <w:fldChar w:fldCharType="begin"/>
-        </w:r>
-        <w:r>
-          <w:rPr>
-            <w:noProof/>
-            <w:webHidden/>
-          </w:rPr>
-          <w:instrText xml:space="preserve"> PAGEREF _Toc242697048 \h </w:instrText>
+          <w:instrText xml:space="preserve"> PAGEREF _Toc243489829 \h </w:instrText>
         </w:r>
         <w:r>
           <w:rPr>
@@ -2391,22 +2639,22 @@
       <w:pPr>
         <w:pStyle w:val="Heading1"/>
       </w:pPr>
-      <w:bookmarkStart w:id="0" w:name="_Toc242697020"/>
+      <w:bookmarkStart w:id="1" w:name="_Toc243489802"/>
       <w:r>
         <w:lastRenderedPageBreak/>
         <w:t>1. INTRODUCTION</w:t>
       </w:r>
-      <w:bookmarkEnd w:id="0"/>
+      <w:bookmarkEnd w:id="1"/>
     </w:p>
     <w:p>
       <w:pPr>
         <w:pStyle w:val="Heading2"/>
       </w:pPr>
-      <w:bookmarkStart w:id="1" w:name="_Toc242697021"/>
+      <w:bookmarkStart w:id="2" w:name="_Toc243489803"/>
       <w:r>
         <w:t>1.1 Background</w:t>
       </w:r>
-      <w:bookmarkEnd w:id="1"/>
+      <w:bookmarkEnd w:id="2"/>
     </w:p>
     <w:p>
       <w:r>
@@ -2420,11 +2668,11 @@
       <w:pPr>
         <w:pStyle w:val="Heading2"/>
       </w:pPr>
-      <w:bookmarkStart w:id="2" w:name="_Toc242697022"/>
+      <w:bookmarkStart w:id="3" w:name="_Toc243489804"/>
       <w:r>
         <w:t>1.2 Objectives of the collaboration</w:t>
       </w:r>
-      <w:bookmarkEnd w:id="2"/>
+      <w:bookmarkEnd w:id="3"/>
     </w:p>
     <w:p>
       <w:pPr>
@@ -2466,11 +2714,11 @@
       <w:pPr>
         <w:pStyle w:val="Heading2"/>
       </w:pPr>
-      <w:bookmarkStart w:id="3" w:name="_Toc242697023"/>
+      <w:bookmarkStart w:id="4" w:name="_Toc243489805"/>
       <w:r>
         <w:t>1.3 Scope and compliance</w:t>
       </w:r>
-      <w:bookmarkEnd w:id="3"/>
+      <w:bookmarkEnd w:id="4"/>
     </w:p>
     <w:p>
       <w:r>
@@ -2481,11 +2729,11 @@
       <w:pPr>
         <w:pStyle w:val="Heading2"/>
       </w:pPr>
-      <w:bookmarkStart w:id="4" w:name="_Toc242697024"/>
+      <w:bookmarkStart w:id="5" w:name="_Toc243489806"/>
       <w:r>
         <w:t>1.4 Documentation map against the CGCT Model 1 checklist</w:t>
       </w:r>
-      <w:bookmarkEnd w:id="4"/>
+      <w:bookmarkEnd w:id="5"/>
     </w:p>
     <w:tbl>
       <w:tblPr>
@@ -2609,7 +2857,7 @@
               <w:rPr>
                 <w:sz w:val="19"/>
               </w:rPr>
-              <w:t>Section 4 and the links table (Section 7.4); screenshots in Appendix B (Figures 1–10); access summary in Appendix D.</w:t>
+              <w:t>Section 4 and the links table (Section 7.4); screenshots in Appendix A (Figures 1–11).</w:t>
             </w:r>
           </w:p>
         </w:tc>
@@ -2646,7 +2894,7 @@
               <w:rPr>
                 <w:sz w:val="19"/>
               </w:rPr>
-              <w:t>Section 6 (usage evidence as at 12 October 2026); Appendix B (Figures 3–7, 9); roster and submissions monitoring screenshots.</w:t>
+              <w:t>Section 6 (usage evidence as at 12 October 2026); Appendix A (Figures 3–7, 9); roster and submissions monitoring screenshots.</w:t>
             </w:r>
           </w:p>
         </w:tc>
@@ -2659,18 +2907,18 @@
           <w:color w:val="595959"/>
           <w:sz w:val="19"/>
         </w:rPr>
-        <w:t>The completed Model 1 checklist is reproduced in Appendix A.</w:t>
+        <w:t>The completed Model 1 checklist is reproduced at the front of this report, immediately after the cover page.</w:t>
       </w:r>
     </w:p>
     <w:p>
       <w:pPr>
         <w:pStyle w:val="Heading1"/>
       </w:pPr>
-      <w:bookmarkStart w:id="5" w:name="_Toc242697025"/>
+      <w:bookmarkStart w:id="6" w:name="_Toc243489807"/>
       <w:r>
         <w:t>2. COURSE AND PROGRAMME INFORMATION</w:t>
       </w:r>
-      <w:bookmarkEnd w:id="5"/>
+      <w:bookmarkEnd w:id="6"/>
     </w:p>
     <w:tbl>
       <w:tblPr>
@@ -3146,7 +3394,7 @@
               <w:rPr>
                 <w:sz w:val="19"/>
               </w:rPr>
-              <w:t>En Ahmad Khairul Nizam Bin Bahrinal — Branch Manager Principal, Homefield Real Estate Sdn Bhd (CV: Appendix C)</w:t>
+              <w:t>En Ahmad Khairul Nizam Bin Bahrinal — Branch Manager Principal, Homefield Real Estate Sdn Bhd (CV: Appendix B)</w:t>
             </w:r>
           </w:p>
         </w:tc>
@@ -3194,11 +3442,11 @@
       <w:pPr>
         <w:pStyle w:val="Heading1"/>
       </w:pPr>
-      <w:bookmarkStart w:id="6" w:name="_Toc242697026"/>
+      <w:bookmarkStart w:id="7" w:name="_Toc243489808"/>
       <w:r>
         <w:t>3. COLLABORATION STRUCTURE AND ROLES</w:t>
       </w:r>
-      <w:bookmarkEnd w:id="6"/>
+      <w:bookmarkEnd w:id="7"/>
     </w:p>
     <w:p>
       <w:r>
@@ -3449,21 +3697,21 @@
       <w:pPr>
         <w:pStyle w:val="Heading1"/>
       </w:pPr>
-      <w:bookmarkStart w:id="7" w:name="_Toc242697027"/>
+      <w:bookmarkStart w:id="8" w:name="_Toc243489809"/>
       <w:r>
         <w:t>4. DEVELOPED CONTENT — MEQ545 ALL-QUIZ TUTORIAL PORTAL</w:t>
       </w:r>
-      <w:bookmarkEnd w:id="7"/>
+      <w:bookmarkEnd w:id="8"/>
     </w:p>
     <w:p>
       <w:pPr>
         <w:pStyle w:val="Heading2"/>
       </w:pPr>
-      <w:bookmarkStart w:id="8" w:name="_Toc242697028"/>
+      <w:bookmarkStart w:id="9" w:name="_Toc243489810"/>
       <w:r>
         <w:t>4.1 Overview</w:t>
       </w:r>
-      <w:bookmarkEnd w:id="8"/>
+      <w:bookmarkEnd w:id="9"/>
     </w:p>
     <w:p>
       <w:r>
@@ -3520,11 +3768,11 @@
       <w:pPr>
         <w:pStyle w:val="Heading2"/>
       </w:pPr>
-      <w:bookmarkStart w:id="9" w:name="_Toc242697029"/>
+      <w:bookmarkStart w:id="10" w:name="_Toc243489811"/>
       <w:r>
         <w:t>4.2 Content matrix (10 tutorial sets / 107 questions)</w:t>
       </w:r>
-      <w:bookmarkEnd w:id="9"/>
+      <w:bookmarkEnd w:id="10"/>
     </w:p>
     <w:tbl>
       <w:tblPr>
@@ -4769,11 +5017,11 @@
       <w:pPr>
         <w:pStyle w:val="Heading2"/>
       </w:pPr>
-      <w:bookmarkStart w:id="10" w:name="_Toc242697030"/>
+      <w:bookmarkStart w:id="11" w:name="_Toc243489812"/>
       <w:r>
         <w:t>4.3 Access</w:t>
       </w:r>
-      <w:bookmarkEnd w:id="10"/>
+      <w:bookmarkEnd w:id="11"/>
     </w:p>
     <w:p>
       <w:r>
@@ -4817,11 +5065,11 @@
       <w:pPr>
         <w:pStyle w:val="Heading2"/>
       </w:pPr>
-      <w:bookmarkStart w:id="11" w:name="_Toc242697031"/>
+      <w:bookmarkStart w:id="12" w:name="_Toc243489813"/>
       <w:r>
         <w:t>4.4 Quality assurance</w:t>
       </w:r>
-      <w:bookmarkEnd w:id="11"/>
+      <w:bookmarkEnd w:id="12"/>
     </w:p>
     <w:p>
       <w:r>
@@ -4832,22 +5080,22 @@
       <w:pPr>
         <w:pStyle w:val="Heading1"/>
       </w:pPr>
-      <w:bookmarkStart w:id="12" w:name="_Toc242697032"/>
+      <w:bookmarkStart w:id="13" w:name="_Toc243489814"/>
       <w:r>
         <w:lastRenderedPageBreak/>
         <w:t>5. COLLABORATION WORKFLOW AND ATTRIBUTION</w:t>
       </w:r>
-      <w:bookmarkEnd w:id="12"/>
+      <w:bookmarkEnd w:id="13"/>
     </w:p>
     <w:p>
       <w:pPr>
         <w:pStyle w:val="Heading2"/>
       </w:pPr>
-      <w:bookmarkStart w:id="13" w:name="_Toc242697033"/>
+      <w:bookmarkStart w:id="14" w:name="_Toc243489815"/>
       <w:r>
         <w:t>5.1 Workflow</w:t>
       </w:r>
-      <w:bookmarkEnd w:id="13"/>
+      <w:bookmarkEnd w:id="14"/>
     </w:p>
     <w:p>
       <w:pPr>
@@ -4898,11 +5146,11 @@
       <w:pPr>
         <w:pStyle w:val="Heading2"/>
       </w:pPr>
-      <w:bookmarkStart w:id="14" w:name="_Toc242697034"/>
+      <w:bookmarkStart w:id="15" w:name="_Toc243489816"/>
       <w:r>
         <w:t>5.2 Attribution</w:t>
       </w:r>
-      <w:bookmarkEnd w:id="14"/>
+      <w:bookmarkEnd w:id="15"/>
     </w:p>
     <w:tbl>
       <w:tblPr>
@@ -5143,15 +5391,15 @@
       <w:pPr>
         <w:pStyle w:val="Heading2"/>
       </w:pPr>
-      <w:bookmarkStart w:id="15" w:name="_Toc242697035"/>
+      <w:bookmarkStart w:id="16" w:name="_Toc243489817"/>
       <w:r>
         <w:t>5.3 Industry panel contribution</w:t>
       </w:r>
-      <w:bookmarkEnd w:id="15"/>
+      <w:bookmarkEnd w:id="16"/>
     </w:p>
     <w:p>
       <w:r>
-        <w:t>En Ahmad Khairul Nizam Bin Bahrinal is Branch Manager Principal at Homefield Real Estate Sdn Bhd and holds a BSc in Mechanical Engineering (Korea University). His expertise covers project management, feasibility studies, cost optimisation, operational and capital expenditure (Opex/Capex) planning, and analytics (Power BI/SPSS), with CAD proficiency. His full CV is at Appendix C. Within Model 1 he contributed and validated industry-context scenarios, including:</w:t>
+        <w:t>En Ahmad Khairul Nizam Bin Bahrinal is Branch Manager Principal at Homefield Real Estate Sdn Bhd and holds a BSc in Mechanical Engineering (Korea University). His expertise covers project management, feasibility studies, cost optimisation, operational and capital expenditure (Opex/Capex) planning, and analytics (Power BI/SPSS), with CAD proficiency. His full CV is at Appendix B. Within Model 1 he contributed and validated industry-context scenarios, including:</w:t>
       </w:r>
     </w:p>
     <w:p>
@@ -5194,11 +5442,11 @@
       <w:pPr>
         <w:pStyle w:val="Heading2"/>
       </w:pPr>
-      <w:bookmarkStart w:id="16" w:name="_Toc242697036"/>
+      <w:bookmarkStart w:id="17" w:name="_Toc243489818"/>
       <w:r>
         <w:t>5.4 Tuned teaching plan (checklist item (a))</w:t>
       </w:r>
-      <w:bookmarkEnd w:id="16"/>
+      <w:bookmarkEnd w:id="17"/>
     </w:p>
     <w:p>
       <w:r>
@@ -5216,21 +5464,21 @@
       <w:pPr>
         <w:pStyle w:val="Heading1"/>
       </w:pPr>
-      <w:bookmarkStart w:id="17" w:name="_Toc242697037"/>
+      <w:bookmarkStart w:id="18" w:name="_Toc243489819"/>
       <w:r>
         <w:t>6. IMPLEMENTATION EVIDENCE (AS AT 12 OCTOBER 2026)</w:t>
       </w:r>
-      <w:bookmarkEnd w:id="17"/>
+      <w:bookmarkEnd w:id="18"/>
     </w:p>
     <w:p>
       <w:pPr>
         <w:pStyle w:val="Heading2"/>
       </w:pPr>
-      <w:bookmarkStart w:id="18" w:name="_Toc242697038"/>
+      <w:bookmarkStart w:id="19" w:name="_Toc243489820"/>
       <w:r>
         <w:t>6.1 Usage metrics</w:t>
       </w:r>
-      <w:bookmarkEnd w:id="18"/>
+      <w:bookmarkEnd w:id="19"/>
     </w:p>
     <w:tbl>
       <w:tblPr>
@@ -5635,36 +5883,36 @@
           <w:color w:val="595959"/>
           <w:sz w:val="19"/>
         </w:rPr>
-        <w:t>All metrics are drawn live from the portal database (Firebase Firestore) and are reproducible from the staff dashboard; the screenshots in Appendix B (Figures 5–7, 9) evidence the same.</w:t>
+        <w:t>All metrics are drawn live from the portal database (Firebase Firestore) and are reproducible from the staff dashboard; the screenshots in Appendix A (Figures 5–7, 9) evidence the same.</w:t>
       </w:r>
     </w:p>
     <w:p>
       <w:pPr>
         <w:pStyle w:val="Heading2"/>
       </w:pPr>
-      <w:bookmarkStart w:id="19" w:name="_Toc242697039"/>
+      <w:bookmarkStart w:id="20" w:name="_Toc243489821"/>
       <w:r>
         <w:t>6.2 Evidence of sessions conducted with students and content (checklist item (c))</w:t>
       </w:r>
-      <w:bookmarkEnd w:id="19"/>
+      <w:bookmarkEnd w:id="20"/>
     </w:p>
     <w:p>
       <w:r>
-        <w:t>Figure 3 shows a live student session: the student is signed in and the portal lists the available tutorial sets with per-student completion badges. Figure 6 shows the roster of all 17 registered students, and Figure 7 shows the staff view of submissions with per-student scores and attendance ticks. Figure 4 shows the attendance e-signature pad presented before a tutorial starts (blank pad shown before signing). Figure 8 shows the student question view with a worked explanation, and Figure 9 shows the atten</w:t>
+        <w:t xml:space="preserve">Figure 3 shows a live student session: the student is signed in and the portal lists the available tutorial sets with per-student completion badges. Figure 6 shows the roster of all 17 registered students, and Figure 7 shows the staff view of submissions with per-student scores and attendance ticks. Figure 4 shows the attendance e-signature pad presented before a tutorial starts. Figure 8 shows the student question view with a worked explanation, and Figure 9 shows the signed attendance record generated by </w:t>
       </w:r>
       <w:r>
-        <w:t>dance record format generated by the portal.</w:t>
+        <w:t>the portal, in which each student's captured e-signature is printed against the tutorial date.</w:t>
       </w:r>
     </w:p>
     <w:p>
       <w:pPr>
         <w:pStyle w:val="Heading2"/>
       </w:pPr>
-      <w:bookmarkStart w:id="20" w:name="_Toc242697040"/>
+      <w:bookmarkStart w:id="21" w:name="_Toc243489822"/>
       <w:r>
         <w:t>6.3 Notes on interpretation</w:t>
       </w:r>
-      <w:bookmarkEnd w:id="20"/>
+      <w:bookmarkEnd w:id="21"/>
     </w:p>
     <w:p>
       <w:r>
@@ -5675,21 +5923,21 @@
       <w:pPr>
         <w:pStyle w:val="Heading1"/>
       </w:pPr>
-      <w:bookmarkStart w:id="21" w:name="_Toc242697041"/>
+      <w:bookmarkStart w:id="22" w:name="_Toc243489823"/>
       <w:r>
         <w:t>7. REFLECTION AND CONTINUATION PLAN</w:t>
       </w:r>
-      <w:bookmarkEnd w:id="21"/>
+      <w:bookmarkEnd w:id="22"/>
     </w:p>
     <w:p>
       <w:pPr>
         <w:pStyle w:val="Heading2"/>
       </w:pPr>
-      <w:bookmarkStart w:id="22" w:name="_Toc242697042"/>
+      <w:bookmarkStart w:id="23" w:name="_Toc243489824"/>
       <w:r>
         <w:t>7.1 Outcomes</w:t>
       </w:r>
-      <w:bookmarkEnd w:id="22"/>
+      <w:bookmarkEnd w:id="23"/>
     </w:p>
     <w:p>
       <w:r>
@@ -5700,11 +5948,11 @@
       <w:pPr>
         <w:pStyle w:val="Heading2"/>
       </w:pPr>
-      <w:bookmarkStart w:id="23" w:name="_Toc242697043"/>
+      <w:bookmarkStart w:id="24" w:name="_Toc243489825"/>
       <w:r>
         <w:t>7.2 Observations and improvements</w:t>
       </w:r>
-      <w:bookmarkEnd w:id="23"/>
+      <w:bookmarkEnd w:id="24"/>
     </w:p>
     <w:p>
       <w:pPr>
@@ -5737,12 +5985,12 @@
       <w:pPr>
         <w:pStyle w:val="Heading2"/>
       </w:pPr>
-      <w:bookmarkStart w:id="24" w:name="_Toc242697044"/>
+      <w:bookmarkStart w:id="25" w:name="_Toc243489826"/>
       <w:r>
         <w:lastRenderedPageBreak/>
         <w:t>7.3 Continuation plan</w:t>
       </w:r>
-      <w:bookmarkEnd w:id="24"/>
+      <w:bookmarkEnd w:id="25"/>
     </w:p>
     <w:p>
       <w:pPr>
@@ -5784,11 +6032,11 @@
       <w:pPr>
         <w:pStyle w:val="Heading2"/>
       </w:pPr>
-      <w:bookmarkStart w:id="25" w:name="_Toc242697045"/>
+      <w:bookmarkStart w:id="26" w:name="_Toc243489827"/>
       <w:r>
         <w:t>7.4 Links</w:t>
       </w:r>
-      <w:bookmarkEnd w:id="25"/>
+      <w:bookmarkEnd w:id="26"/>
     </w:p>
     <w:tbl>
       <w:tblPr>
@@ -6038,258 +6286,10 @@
       <w:pPr>
         <w:pStyle w:val="Heading1"/>
       </w:pPr>
-      <w:bookmarkStart w:id="26" w:name="_Toc242697046"/>
+      <w:bookmarkStart w:id="27" w:name="_Toc243489828"/>
       <w:r>
         <w:lastRenderedPageBreak/>
-        <w:t>APPENDIX A — COMPLETED CGCT MODEL 1 CHECKLIST</w:t>
-      </w:r>
-      <w:bookmarkEnd w:id="26"/>
-    </w:p>
-    <w:tbl>
-      <w:tblPr>
-        <w:tblStyle w:val="TableGrid"/>
-        <w:tblW w:w="0" w:type="auto"/>
-        <w:jc w:val="center"/>
-        <w:tblLayout w:type="fixed"/>
-        <w:tblLook w:val="04A0" w:firstRow="1" w:lastRow="0" w:firstColumn="1" w:lastColumn="0" w:noHBand="0" w:noVBand="1"/>
-      </w:tblPr>
-      <w:tblGrid>
-        <w:gridCol w:w="2608"/>
-        <w:gridCol w:w="2494"/>
-        <w:gridCol w:w="4082"/>
-      </w:tblGrid>
-      <w:tr>
-        <w:trPr>
-          <w:jc w:val="center"/>
-        </w:trPr>
-        <w:tc>
-          <w:tcPr>
-            <w:tcW w:w="2608" w:type="dxa"/>
-            <w:shd w:val="clear" w:color="auto" w:fill="EFE9F7"/>
-          </w:tcPr>
-          <w:p>
-            <w:pPr>
-              <w:spacing w:after="40"/>
-            </w:pPr>
-            <w:r>
-              <w:rPr>
-                <w:b/>
-                <w:sz w:val="18"/>
-              </w:rPr>
-              <w:t>Checklist item</w:t>
-            </w:r>
-          </w:p>
-        </w:tc>
-        <w:tc>
-          <w:tcPr>
-            <w:tcW w:w="2494" w:type="dxa"/>
-            <w:shd w:val="clear" w:color="auto" w:fill="EFE9F7"/>
-          </w:tcPr>
-          <w:p>
-            <w:pPr>
-              <w:spacing w:after="40"/>
-            </w:pPr>
-            <w:r>
-              <w:rPr>
-                <w:b/>
-                <w:sz w:val="18"/>
-              </w:rPr>
-              <w:t>Requirement</w:t>
-            </w:r>
-          </w:p>
-        </w:tc>
-        <w:tc>
-          <w:tcPr>
-            <w:tcW w:w="4082" w:type="dxa"/>
-            <w:shd w:val="clear" w:color="auto" w:fill="EFE9F7"/>
-          </w:tcPr>
-          <w:p>
-            <w:pPr>
-              <w:spacing w:after="40"/>
-            </w:pPr>
-            <w:r>
-              <w:rPr>
-                <w:b/>
-                <w:sz w:val="18"/>
-              </w:rPr>
-              <w:t>Evidence / status</w:t>
-            </w:r>
-          </w:p>
-        </w:tc>
-      </w:tr>
-      <w:tr>
-        <w:trPr>
-          <w:jc w:val="center"/>
-        </w:trPr>
-        <w:tc>
-          <w:tcPr>
-            <w:tcW w:w="2608" w:type="dxa"/>
-          </w:tcPr>
-          <w:p>
-            <w:pPr>
-              <w:spacing w:after="40"/>
-            </w:pPr>
-            <w:r>
-              <w:rPr>
-                <w:sz w:val="18"/>
-              </w:rPr>
-              <w:t>(a) Scheme of work that includes the developed topics</w:t>
-            </w:r>
-          </w:p>
-        </w:tc>
-        <w:tc>
-          <w:tcPr>
-            <w:tcW w:w="2494" w:type="dxa"/>
-          </w:tcPr>
-          <w:p>
-            <w:pPr>
-              <w:spacing w:after="40"/>
-            </w:pPr>
-            <w:r>
-              <w:rPr>
-                <w:sz w:val="18"/>
-              </w:rPr>
-              <w:t>Updated scheme of work showing the topics developed collaboratively</w:t>
-            </w:r>
-          </w:p>
-        </w:tc>
-        <w:tc>
-          <w:tcPr>
-            <w:tcW w:w="4082" w:type="dxa"/>
-          </w:tcPr>
-          <w:p>
-            <w:pPr>
-              <w:spacing w:after="40"/>
-            </w:pPr>
-            <w:r>
-              <w:rPr>
-                <w:sz w:val="18"/>
-              </w:rPr>
-              <w:t>PROVIDED — tuned teaching plan with the 'Developed Content (CGCT Model 1)' column and collaboration block (companion docx/pdf; web app: Section 7.4). Status: complete.</w:t>
-            </w:r>
-          </w:p>
-        </w:tc>
-      </w:tr>
-      <w:tr>
-        <w:trPr>
-          <w:jc w:val="center"/>
-        </w:trPr>
-        <w:tc>
-          <w:tcPr>
-            <w:tcW w:w="2608" w:type="dxa"/>
-          </w:tcPr>
-          <w:p>
-            <w:pPr>
-              <w:spacing w:after="40"/>
-            </w:pPr>
-            <w:r>
-              <w:rPr>
-                <w:sz w:val="18"/>
-              </w:rPr>
-              <w:t>(b) Link / screenshots of the developed content</w:t>
-            </w:r>
-          </w:p>
-        </w:tc>
-        <w:tc>
-          <w:tcPr>
-            <w:tcW w:w="2494" w:type="dxa"/>
-          </w:tcPr>
-          <w:p>
-            <w:pPr>
-              <w:spacing w:after="40"/>
-            </w:pPr>
-            <w:r>
-              <w:rPr>
-                <w:sz w:val="18"/>
-              </w:rPr>
-              <w:t>Access link and screenshots of the developed content</w:t>
-            </w:r>
-          </w:p>
-        </w:tc>
-        <w:tc>
-          <w:tcPr>
-            <w:tcW w:w="4082" w:type="dxa"/>
-          </w:tcPr>
-          <w:p>
-            <w:pPr>
-              <w:spacing w:after="40"/>
-            </w:pPr>
-            <w:r>
-              <w:rPr>
-                <w:sz w:val="18"/>
-              </w:rPr>
-              <w:t>PROVIDED — live portal and repository links (Sections 4.3, 7.4); screenshots: Figures 1–10 (Appendix B). Status: complete.</w:t>
-            </w:r>
-          </w:p>
-        </w:tc>
-      </w:tr>
-      <w:tr>
-        <w:trPr>
-          <w:jc w:val="center"/>
-        </w:trPr>
-        <w:tc>
-          <w:tcPr>
-            <w:tcW w:w="2608" w:type="dxa"/>
-          </w:tcPr>
-          <w:p>
-            <w:pPr>
-              <w:spacing w:after="40"/>
-            </w:pPr>
-            <w:r>
-              <w:rPr>
-                <w:sz w:val="18"/>
-              </w:rPr>
-              <w:t>(c) Evidence of session(s) conducted with students and content</w:t>
-            </w:r>
-          </w:p>
-        </w:tc>
-        <w:tc>
-          <w:tcPr>
-            <w:tcW w:w="2494" w:type="dxa"/>
-          </w:tcPr>
-          <w:p>
-            <w:pPr>
-              <w:spacing w:after="40"/>
-            </w:pPr>
-            <w:r>
-              <w:rPr>
-                <w:sz w:val="18"/>
-              </w:rPr>
-              <w:t>Evidence of sessions conducted involving students and the developed content (e.g., photographs/screenshots)</w:t>
-            </w:r>
-          </w:p>
-        </w:tc>
-        <w:tc>
-          <w:tcPr>
-            <w:tcW w:w="4082" w:type="dxa"/>
-          </w:tcPr>
-          <w:p>
-            <w:pPr>
-              <w:spacing w:after="40"/>
-            </w:pPr>
-            <w:r>
-              <w:rPr>
-                <w:sz w:val="18"/>
-              </w:rPr>
-              <w:t>PROVIDED — student session with content (Figure 3), class roster (Figure 6), submissions with scores and attendance (Figure 7), attendance e-signature (Figure 4), generated attendance record (Figure 9). Status: complete.</w:t>
-            </w:r>
-          </w:p>
-        </w:tc>
-      </w:tr>
-    </w:tbl>
-    <w:p>
-      <w:r>
-        <w:br w:type="page"/>
-      </w:r>
-    </w:p>
-    <w:p>
-      <w:pPr>
-        <w:pStyle w:val="Heading1"/>
-      </w:pPr>
-      <w:bookmarkStart w:id="27" w:name="_Toc242697047"/>
-      <w:r>
-        <w:lastRenderedPageBreak/>
-        <w:t>APPENDIX B — EVIDENCE: SCREEN CAPTURES</w:t>
+        <w:t>APPENDIX A — EVIDENCE: SCREEN CAPTURES</w:t>
       </w:r>
       <w:bookmarkEnd w:id="27"/>
     </w:p>
@@ -6300,7 +6300,7 @@
           <w:color w:val="595959"/>
           <w:sz w:val="19"/>
         </w:rPr>
-        <w:t>All captures were taken from the live portal (meq545-all-quiz-portal-hub.pages.dev) and the teaching plan web app on 12 October 2026, and are provided as separate image files in the accompanying evidence folder.</w:t>
+        <w:t>All captures were taken from the live portal (meq545-all-quiz-portal-hub.pages.dev) and the teaching plan web app, and are provided as separate image files in the accompanying evidence folder; Figure 9 is the signed attendance record exported by the portal (full signed PDF supplied in the evidence folder).</w:t>
       </w:r>
     </w:p>
     <w:p>
@@ -6313,7 +6313,7 @@
           <w:noProof/>
         </w:rPr>
         <w:drawing>
-          <wp:inline distT="0" distB="0" distL="0" distR="0" wp14:anchorId="3D8DAEF6" wp14:editId="7F7DED5A">
+          <wp:inline distT="0" distB="0" distL="0" distR="0" wp14:anchorId="2FD74ADB" wp14:editId="715F721F">
             <wp:extent cx="5580000" cy="3487500"/>
             <wp:effectExtent l="0" t="0" r="0" b="0"/>
             <wp:docPr id="4" name="Picture 4"/>
@@ -6379,7 +6379,7 @@
         </w:rPr>
         <w:lastRenderedPageBreak/>
         <w:drawing>
-          <wp:inline distT="0" distB="0" distL="0" distR="0" wp14:anchorId="1D079BAB" wp14:editId="47EBC045">
+          <wp:inline distT="0" distB="0" distL="0" distR="0" wp14:anchorId="75AA02CC" wp14:editId="163A4FE9">
             <wp:extent cx="5580000" cy="3487500"/>
             <wp:effectExtent l="0" t="0" r="0" b="0"/>
             <wp:docPr id="5" name="Picture 5"/>
@@ -6445,7 +6445,7 @@
         </w:rPr>
         <w:lastRenderedPageBreak/>
         <w:drawing>
-          <wp:inline distT="0" distB="0" distL="0" distR="0" wp14:anchorId="3A3BE60B" wp14:editId="26F4F8B5">
+          <wp:inline distT="0" distB="0" distL="0" distR="0" wp14:anchorId="5618649A" wp14:editId="00D84250">
             <wp:extent cx="5580000" cy="3487500"/>
             <wp:effectExtent l="0" t="0" r="0" b="0"/>
             <wp:docPr id="6" name="Picture 6"/>
@@ -6511,7 +6511,7 @@
         </w:rPr>
         <w:lastRenderedPageBreak/>
         <w:drawing>
-          <wp:inline distT="0" distB="0" distL="0" distR="0" wp14:anchorId="1EF600E3" wp14:editId="5E8CC2BB">
+          <wp:inline distT="0" distB="0" distL="0" distR="0" wp14:anchorId="0374ACCA" wp14:editId="2E157DED">
             <wp:extent cx="5580000" cy="3487500"/>
             <wp:effectExtent l="0" t="0" r="0" b="0"/>
             <wp:docPr id="7" name="Picture 7"/>
@@ -6558,7 +6558,7 @@
           <w:color w:val="595959"/>
           <w:sz w:val="17"/>
         </w:rPr>
-        <w:t>Figure 4 — Attendance e-signature pad presented before a tutorial starts (blank pad shown before signing; the signature is stored with the attendance record).</w:t>
+        <w:t>Figure 4 — Attendance e-signature pad presented before a tutorial starts (shown before signing; every captured signature is stored and printed in the signed attendance record — Figure 9).</w:t>
       </w:r>
     </w:p>
     <w:p>
@@ -6577,7 +6577,7 @@
         </w:rPr>
         <w:lastRenderedPageBreak/>
         <w:drawing>
-          <wp:inline distT="0" distB="0" distL="0" distR="0" wp14:anchorId="59175799" wp14:editId="6F887659">
+          <wp:inline distT="0" distB="0" distL="0" distR="0" wp14:anchorId="098CC972" wp14:editId="7918D485">
             <wp:extent cx="5580000" cy="4603500"/>
             <wp:effectExtent l="0" t="0" r="0" b="0"/>
             <wp:docPr id="8" name="Picture 8"/>
@@ -6643,7 +6643,7 @@
         </w:rPr>
         <w:lastRenderedPageBreak/>
         <w:drawing>
-          <wp:inline distT="0" distB="0" distL="0" distR="0" wp14:anchorId="61313881" wp14:editId="38519697">
+          <wp:inline distT="0" distB="0" distL="0" distR="0" wp14:anchorId="489DDA0E" wp14:editId="6AC32453">
             <wp:extent cx="5580000" cy="5771167"/>
             <wp:effectExtent l="0" t="0" r="0" b="0"/>
             <wp:docPr id="9" name="Picture 9"/>
@@ -6709,7 +6709,7 @@
         </w:rPr>
         <w:lastRenderedPageBreak/>
         <w:drawing>
-          <wp:inline distT="0" distB="0" distL="0" distR="0" wp14:anchorId="2D0ADDA6" wp14:editId="14E5E507">
+          <wp:inline distT="0" distB="0" distL="0" distR="0" wp14:anchorId="5B556ACE" wp14:editId="76EF34D4">
             <wp:extent cx="5580000" cy="3487500"/>
             <wp:effectExtent l="0" t="0" r="0" b="0"/>
             <wp:docPr id="10" name="Picture 10"/>
@@ -6775,7 +6775,7 @@
         </w:rPr>
         <w:lastRenderedPageBreak/>
         <w:drawing>
-          <wp:inline distT="0" distB="0" distL="0" distR="0" wp14:anchorId="528FE81A" wp14:editId="75C80DE0">
+          <wp:inline distT="0" distB="0" distL="0" distR="0" wp14:anchorId="51CA9A9B" wp14:editId="649A143B">
             <wp:extent cx="5580000" cy="3487500"/>
             <wp:effectExtent l="0" t="0" r="0" b="0"/>
             <wp:docPr id="11" name="Picture 11"/>
@@ -6841,8 +6841,8 @@
         </w:rPr>
         <w:lastRenderedPageBreak/>
         <w:drawing>
-          <wp:inline distT="0" distB="0" distL="0" distR="0" wp14:anchorId="16C941D0" wp14:editId="41EE90B8">
-            <wp:extent cx="5230347" cy="6767999"/>
+          <wp:inline distT="0" distB="0" distL="0" distR="0" wp14:anchorId="0607192B" wp14:editId="595D3227">
+            <wp:extent cx="4960837" cy="6767999"/>
             <wp:effectExtent l="0" t="0" r="0" b="0"/>
             <wp:docPr id="12" name="Picture 12"/>
             <wp:cNvGraphicFramePr>
@@ -6864,7 +6864,7 @@
                   <pic:spPr>
                     <a:xfrm>
                       <a:off x="0" y="0"/>
-                      <a:ext cx="5230347" cy="6767999"/>
+                      <a:ext cx="4960837" cy="6767999"/>
                     </a:xfrm>
                     <a:prstGeom prst="rect">
                       <a:avLst/>
@@ -6888,7 +6888,7 @@
           <w:color w:val="595959"/>
           <w:sz w:val="17"/>
         </w:rPr>
-        <w:t>Figure 9 — Attendance record generated by the portal ('Attendance PDF' export format, page 1).</w:t>
+        <w:t>Figure 9 — Signed attendance record generated by the portal ('Attendance PDF' export, official HEA/RP/KH-01 format): detail of the tutorial columns, where each student's captured e-signature is printed under the tutorial date. The full signed PDF is supplied in the evidence folder.</w:t>
       </w:r>
     </w:p>
     <w:p>
@@ -6907,7 +6907,7 @@
         </w:rPr>
         <w:lastRenderedPageBreak/>
         <w:drawing>
-          <wp:inline distT="0" distB="0" distL="0" distR="0" wp14:anchorId="7832B99C" wp14:editId="4D077C8C">
+          <wp:inline distT="0" distB="0" distL="0" distR="0" wp14:anchorId="6759F076" wp14:editId="006AC719">
             <wp:extent cx="5580000" cy="3487500"/>
             <wp:effectExtent l="0" t="0" r="0" b="0"/>
             <wp:docPr id="13" name="Picture 13"/>
@@ -6973,7 +6973,7 @@
         </w:rPr>
         <w:lastRenderedPageBreak/>
         <w:drawing>
-          <wp:inline distT="0" distB="0" distL="0" distR="0" wp14:anchorId="3341EFD6" wp14:editId="039AAA94">
+          <wp:inline distT="0" distB="0" distL="0" distR="0" wp14:anchorId="1B64B099" wp14:editId="00D79F00">
             <wp:extent cx="5580000" cy="3487500"/>
             <wp:effectExtent l="0" t="0" r="0" b="0"/>
             <wp:docPr id="14" name="Picture 14"/>
@@ -7032,10 +7032,10 @@
       <w:pPr>
         <w:pStyle w:val="Heading1"/>
       </w:pPr>
-      <w:bookmarkStart w:id="28" w:name="_Toc242697048"/>
+      <w:bookmarkStart w:id="28" w:name="_Toc243489829"/>
       <w:r>
         <w:lastRenderedPageBreak/>
-        <w:t>APPENDIX C — INDUSTRY PANEL CURRICULUM VITAE</w:t>
+        <w:t>APPENDIX B — INDUSTRY PANEL CURRICULUM VITAE</w:t>
       </w:r>
       <w:bookmarkEnd w:id="28"/>
     </w:p>
@@ -7054,7 +7054,7 @@
           <w:noProof/>
         </w:rPr>
         <w:drawing>
-          <wp:inline distT="0" distB="0" distL="0" distR="0" wp14:anchorId="5F8EAE54" wp14:editId="7FC2C00D">
+          <wp:inline distT="0" distB="0" distL="0" distR="0" wp14:anchorId="6AFB7191" wp14:editId="4B40B077">
             <wp:extent cx="4963333" cy="7020000"/>
             <wp:effectExtent l="0" t="0" r="0" b="0"/>
             <wp:docPr id="15" name="Picture 15"/>
@@ -7413,31 +7413,31 @@
       </w:rPr>
     </w:lvl>
   </w:abstractNum>
-  <w:num w:numId="1" w16cid:durableId="750465265">
+  <w:num w:numId="1" w16cid:durableId="1829520620">
     <w:abstractNumId w:val="8"/>
   </w:num>
-  <w:num w:numId="2" w16cid:durableId="268006363">
+  <w:num w:numId="2" w16cid:durableId="1964145676">
     <w:abstractNumId w:val="6"/>
   </w:num>
-  <w:num w:numId="3" w16cid:durableId="857309143">
+  <w:num w:numId="3" w16cid:durableId="711003889">
     <w:abstractNumId w:val="5"/>
   </w:num>
-  <w:num w:numId="4" w16cid:durableId="209460853">
+  <w:num w:numId="4" w16cid:durableId="1253322662">
     <w:abstractNumId w:val="4"/>
   </w:num>
-  <w:num w:numId="5" w16cid:durableId="1314144612">
+  <w:num w:numId="5" w16cid:durableId="1727021240">
     <w:abstractNumId w:val="7"/>
   </w:num>
-  <w:num w:numId="6" w16cid:durableId="1934629584">
+  <w:num w:numId="6" w16cid:durableId="1301374965">
     <w:abstractNumId w:val="3"/>
   </w:num>
-  <w:num w:numId="7" w16cid:durableId="1457679448">
+  <w:num w:numId="7" w16cid:durableId="1622226416">
     <w:abstractNumId w:val="2"/>
   </w:num>
-  <w:num w:numId="8" w16cid:durableId="1994555165">
+  <w:num w:numId="8" w16cid:durableId="1659460885">
     <w:abstractNumId w:val="1"/>
   </w:num>
-  <w:num w:numId="9" w16cid:durableId="777213250">
+  <w:num w:numId="9" w16cid:durableId="1898928205">
     <w:abstractNumId w:val="0"/>
   </w:num>
 </w:numbering>
@@ -7835,6 +7835,7 @@
     <w:rsid w:val="00FC693F"/>
     <w:pPr>
       <w:spacing w:after="120" w:line="269" w:lineRule="auto"/>
+      <w:jc w:val="both"/>
     </w:pPr>
     <w:rPr>
       <w:rFonts w:ascii="Arial" w:hAnsi="Arial"/>
@@ -7853,6 +7854,7 @@
       <w:keepNext/>
       <w:keepLines/>
       <w:spacing w:before="280"/>
+      <w:jc w:val="center"/>
       <w:outlineLvl w:val="0"/>
     </w:pPr>
     <w:rPr>
@@ -18829,7 +18831,7 @@
     <w:autoRedefine/>
     <w:uiPriority w:val="39"/>
     <w:unhideWhenUsed/>
-    <w:rsid w:val="009954DA"/>
+    <w:rsid w:val="00C96C93"/>
     <w:pPr>
       <w:spacing w:after="100"/>
     </w:pPr>
@@ -18841,7 +18843,7 @@
     <w:autoRedefine/>
     <w:uiPriority w:val="39"/>
     <w:unhideWhenUsed/>
-    <w:rsid w:val="009954DA"/>
+    <w:rsid w:val="00C96C93"/>
     <w:pPr>
       <w:spacing w:after="100"/>
       <w:ind w:left="210"/>
@@ -18852,7 +18854,7 @@
     <w:basedOn w:val="DefaultParagraphFont"/>
     <w:uiPriority w:val="99"/>
     <w:unhideWhenUsed/>
-    <w:rsid w:val="009954DA"/>
+    <w:rsid w:val="00C96C93"/>
     <w:rPr>
       <w:color w:val="0000FF" w:themeColor="hyperlink"/>
       <w:u w:val="single"/>

</xml_diff>

<commit_message>
Refresh to 21 Oct 2026: live metrics, full signed attendance PDF page, updated screenshots
</commit_message>
<xml_diff>
--- a/assets/docs/cgct-model1-report.docx
+++ b/assets/docs/cgct-model1-report.docx
@@ -25,7 +25,7 @@
                 <w:noProof/>
               </w:rPr>
               <w:drawing>
-                <wp:inline distT="0" distB="0" distL="0" distR="0" wp14:anchorId="36D58C3A" wp14:editId="39716D34">
+                <wp:inline distT="0" distB="0" distL="0" distR="0" wp14:anchorId="54B7656C" wp14:editId="1ABABE46">
                   <wp:extent cx="2015999" cy="1066087"/>
                   <wp:effectExtent l="0" t="0" r="0" b="0"/>
                   <wp:docPr id="1" name="Picture 1"/>
@@ -75,7 +75,7 @@
                 <w:noProof/>
               </w:rPr>
               <w:drawing>
-                <wp:inline distT="0" distB="0" distL="0" distR="0" wp14:anchorId="4F773F74" wp14:editId="2CCA1DA2">
+                <wp:inline distT="0" distB="0" distL="0" distR="0" wp14:anchorId="09223556" wp14:editId="0064D6AC">
                   <wp:extent cx="1944000" cy="802043"/>
                   <wp:effectExtent l="0" t="0" r="0" b="0"/>
                   <wp:docPr id="2" name="Picture 2"/>
@@ -124,7 +124,7 @@
           <w:noProof/>
         </w:rPr>
         <w:drawing>
-          <wp:inline distT="0" distB="0" distL="0" distR="0" wp14:anchorId="60DF972E" wp14:editId="7CB7BCEA">
+          <wp:inline distT="0" distB="0" distL="0" distR="0" wp14:anchorId="378C4154" wp14:editId="1AB2F9E1">
             <wp:extent cx="5688000" cy="1279463"/>
             <wp:effectExtent l="0" t="0" r="0" b="0"/>
             <wp:docPr id="3" name="Picture 3"/>
@@ -281,7 +281,7 @@
         <w:rPr>
           <w:sz w:val="22"/>
         </w:rPr>
-        <w:t>10 tutorial sets · 107 questions</w:t>
+        <w:t>10 tutorial sets · 114 questions</w:t>
       </w:r>
     </w:p>
     <w:p>
@@ -348,7 +348,7 @@
           <w:b/>
           <w:sz w:val="22"/>
         </w:rPr>
-        <w:t>12 October 2026</w:t>
+        <w:t>21 October 2026</w:t>
       </w:r>
     </w:p>
     <w:p>
@@ -386,7 +386,7 @@
       <w:pPr>
         <w:pStyle w:val="Heading1"/>
       </w:pPr>
-      <w:bookmarkStart w:id="0" w:name="_Toc243489801"/>
+      <w:bookmarkStart w:id="0" w:name="_Toc243490353"/>
       <w:r>
         <w:lastRenderedPageBreak/>
         <w:t>COMPLETED CGCT MODEL 1 CHECKLIST</w:t>
@@ -663,7 +663,7 @@
       <w:r>
         <w:fldChar w:fldCharType="separate"/>
       </w:r>
-      <w:hyperlink w:anchor="_Toc243489801" w:history="1">
+      <w:hyperlink w:anchor="_Toc243490353" w:history="1">
         <w:r>
           <w:rPr>
             <w:rStyle w:val="Hyperlink"/>
@@ -690,7 +690,7 @@
             <w:noProof/>
             <w:webHidden/>
           </w:rPr>
-          <w:instrText xml:space="preserve"> PAGEREF _Toc243489801 \h </w:instrText>
+          <w:instrText xml:space="preserve"> PAGEREF _Toc243490353 \h </w:instrText>
         </w:r>
         <w:r>
           <w:rPr>
@@ -731,7 +731,7 @@
           <w:noProof/>
         </w:rPr>
       </w:pPr>
-      <w:hyperlink w:anchor="_Toc243489802" w:history="1">
+      <w:hyperlink w:anchor="_Toc243490354" w:history="1">
         <w:r>
           <w:rPr>
             <w:rStyle w:val="Hyperlink"/>
@@ -758,7 +758,7 @@
             <w:noProof/>
             <w:webHidden/>
           </w:rPr>
-          <w:instrText xml:space="preserve"> PAGEREF _Toc243489802 \h </w:instrText>
+          <w:instrText xml:space="preserve"> PAGEREF _Toc243490354 \h </w:instrText>
         </w:r>
         <w:r>
           <w:rPr>
@@ -799,7 +799,7 @@
           <w:noProof/>
         </w:rPr>
       </w:pPr>
-      <w:hyperlink w:anchor="_Toc243489803" w:history="1">
+      <w:hyperlink w:anchor="_Toc243490355" w:history="1">
         <w:r>
           <w:rPr>
             <w:rStyle w:val="Hyperlink"/>
@@ -826,7 +826,7 @@
             <w:noProof/>
             <w:webHidden/>
           </w:rPr>
-          <w:instrText xml:space="preserve"> PAGEREF _Toc243489803 \h </w:instrText>
+          <w:instrText xml:space="preserve"> PAGEREF _Toc243490355 \h </w:instrText>
         </w:r>
         <w:r>
           <w:rPr>
@@ -867,7 +867,7 @@
           <w:noProof/>
         </w:rPr>
       </w:pPr>
-      <w:hyperlink w:anchor="_Toc243489804" w:history="1">
+      <w:hyperlink w:anchor="_Toc243490356" w:history="1">
         <w:r>
           <w:rPr>
             <w:rStyle w:val="Hyperlink"/>
@@ -894,7 +894,7 @@
             <w:noProof/>
             <w:webHidden/>
           </w:rPr>
-          <w:instrText xml:space="preserve"> PAGEREF _Toc243489804 \h </w:instrText>
+          <w:instrText xml:space="preserve"> PAGEREF _Toc243490356 \h </w:instrText>
         </w:r>
         <w:r>
           <w:rPr>
@@ -935,7 +935,7 @@
           <w:noProof/>
         </w:rPr>
       </w:pPr>
-      <w:hyperlink w:anchor="_Toc243489805" w:history="1">
+      <w:hyperlink w:anchor="_Toc243490357" w:history="1">
         <w:r>
           <w:rPr>
             <w:rStyle w:val="Hyperlink"/>
@@ -962,7 +962,7 @@
             <w:noProof/>
             <w:webHidden/>
           </w:rPr>
-          <w:instrText xml:space="preserve"> PAGEREF _Toc243489805 \h </w:instrText>
+          <w:instrText xml:space="preserve"> PAGEREF _Toc243490357 \h </w:instrText>
         </w:r>
         <w:r>
           <w:rPr>
@@ -1003,7 +1003,7 @@
           <w:noProof/>
         </w:rPr>
       </w:pPr>
-      <w:hyperlink w:anchor="_Toc243489806" w:history="1">
+      <w:hyperlink w:anchor="_Toc243490358" w:history="1">
         <w:r>
           <w:rPr>
             <w:rStyle w:val="Hyperlink"/>
@@ -1030,7 +1030,7 @@
             <w:noProof/>
             <w:webHidden/>
           </w:rPr>
-          <w:instrText xml:space="preserve"> PAGEREF _Toc243489806 \h </w:instrText>
+          <w:instrText xml:space="preserve"> PAGEREF _Toc243490358 \h </w:instrText>
         </w:r>
         <w:r>
           <w:rPr>
@@ -1071,7 +1071,7 @@
           <w:noProof/>
         </w:rPr>
       </w:pPr>
-      <w:hyperlink w:anchor="_Toc243489807" w:history="1">
+      <w:hyperlink w:anchor="_Toc243490359" w:history="1">
         <w:r>
           <w:rPr>
             <w:rStyle w:val="Hyperlink"/>
@@ -1098,7 +1098,7 @@
             <w:noProof/>
             <w:webHidden/>
           </w:rPr>
-          <w:instrText xml:space="preserve"> PAGEREF _Toc243489807 \h </w:instrText>
+          <w:instrText xml:space="preserve"> PAGEREF _Toc243490359 \h </w:instrText>
         </w:r>
         <w:r>
           <w:rPr>
@@ -1139,7 +1139,7 @@
           <w:noProof/>
         </w:rPr>
       </w:pPr>
-      <w:hyperlink w:anchor="_Toc243489808" w:history="1">
+      <w:hyperlink w:anchor="_Toc243490360" w:history="1">
         <w:r>
           <w:rPr>
             <w:rStyle w:val="Hyperlink"/>
@@ -1166,7 +1166,7 @@
             <w:noProof/>
             <w:webHidden/>
           </w:rPr>
-          <w:instrText xml:space="preserve"> PAGEREF _Toc243489808 \h </w:instrText>
+          <w:instrText xml:space="preserve"> PAGEREF _Toc243490360 \h </w:instrText>
         </w:r>
         <w:r>
           <w:rPr>
@@ -1207,7 +1207,7 @@
           <w:noProof/>
         </w:rPr>
       </w:pPr>
-      <w:hyperlink w:anchor="_Toc243489809" w:history="1">
+      <w:hyperlink w:anchor="_Toc243490361" w:history="1">
         <w:r>
           <w:rPr>
             <w:rStyle w:val="Hyperlink"/>
@@ -1234,7 +1234,7 @@
             <w:noProof/>
             <w:webHidden/>
           </w:rPr>
-          <w:instrText xml:space="preserve"> PAGEREF _Toc243489809 \h </w:instrText>
+          <w:instrText xml:space="preserve"> PAGEREF _Toc243490361 \h </w:instrText>
         </w:r>
         <w:r>
           <w:rPr>
@@ -1275,7 +1275,7 @@
           <w:noProof/>
         </w:rPr>
       </w:pPr>
-      <w:hyperlink w:anchor="_Toc243489810" w:history="1">
+      <w:hyperlink w:anchor="_Toc243490362" w:history="1">
         <w:r>
           <w:rPr>
             <w:rStyle w:val="Hyperlink"/>
@@ -1302,7 +1302,7 @@
             <w:noProof/>
             <w:webHidden/>
           </w:rPr>
-          <w:instrText xml:space="preserve"> PAGEREF _Toc243489810 \h </w:instrText>
+          <w:instrText xml:space="preserve"> PAGEREF _Toc243490362 \h </w:instrText>
         </w:r>
         <w:r>
           <w:rPr>
@@ -1343,13 +1343,13 @@
           <w:noProof/>
         </w:rPr>
       </w:pPr>
-      <w:hyperlink w:anchor="_Toc243489811" w:history="1">
+      <w:hyperlink w:anchor="_Toc243490363" w:history="1">
         <w:r>
           <w:rPr>
             <w:rStyle w:val="Hyperlink"/>
             <w:noProof/>
           </w:rPr>
-          <w:t>4.2 Content matrix (10 tutorial sets / 107 questions)</w:t>
+          <w:t>4.2 Content matrix (10 tutorial sets / 114 questions)</w:t>
         </w:r>
         <w:r>
           <w:rPr>
@@ -1370,7 +1370,7 @@
             <w:noProof/>
             <w:webHidden/>
           </w:rPr>
-          <w:instrText xml:space="preserve"> PAGEREF _Toc243489811 \h </w:instrText>
+          <w:instrText xml:space="preserve"> PAGEREF _Toc243490363 \h </w:instrText>
         </w:r>
         <w:r>
           <w:rPr>
@@ -1411,7 +1411,7 @@
           <w:noProof/>
         </w:rPr>
       </w:pPr>
-      <w:hyperlink w:anchor="_Toc243489812" w:history="1">
+      <w:hyperlink w:anchor="_Toc243490364" w:history="1">
         <w:r>
           <w:rPr>
             <w:rStyle w:val="Hyperlink"/>
@@ -1438,7 +1438,7 @@
             <w:noProof/>
             <w:webHidden/>
           </w:rPr>
-          <w:instrText xml:space="preserve"> PAGEREF _Toc243489812 \h </w:instrText>
+          <w:instrText xml:space="preserve"> PAGEREF _Toc243490364 \h </w:instrText>
         </w:r>
         <w:r>
           <w:rPr>
@@ -1479,7 +1479,7 @@
           <w:noProof/>
         </w:rPr>
       </w:pPr>
-      <w:hyperlink w:anchor="_Toc243489813" w:history="1">
+      <w:hyperlink w:anchor="_Toc243490365" w:history="1">
         <w:r>
           <w:rPr>
             <w:rStyle w:val="Hyperlink"/>
@@ -1506,7 +1506,7 @@
             <w:noProof/>
             <w:webHidden/>
           </w:rPr>
-          <w:instrText xml:space="preserve"> PAGEREF _Toc243489813 \h </w:instrText>
+          <w:instrText xml:space="preserve"> PAGEREF _Toc243490365 \h </w:instrText>
         </w:r>
         <w:r>
           <w:rPr>
@@ -1547,7 +1547,7 @@
           <w:noProof/>
         </w:rPr>
       </w:pPr>
-      <w:hyperlink w:anchor="_Toc243489814" w:history="1">
+      <w:hyperlink w:anchor="_Toc243490366" w:history="1">
         <w:r>
           <w:rPr>
             <w:rStyle w:val="Hyperlink"/>
@@ -1574,7 +1574,7 @@
             <w:noProof/>
             <w:webHidden/>
           </w:rPr>
-          <w:instrText xml:space="preserve"> PAGEREF _Toc243489814 \h </w:instrText>
+          <w:instrText xml:space="preserve"> PAGEREF _Toc243490366 \h </w:instrText>
         </w:r>
         <w:r>
           <w:rPr>
@@ -1615,7 +1615,7 @@
           <w:noProof/>
         </w:rPr>
       </w:pPr>
-      <w:hyperlink w:anchor="_Toc243489815" w:history="1">
+      <w:hyperlink w:anchor="_Toc243490367" w:history="1">
         <w:r>
           <w:rPr>
             <w:rStyle w:val="Hyperlink"/>
@@ -1642,7 +1642,7 @@
             <w:noProof/>
             <w:webHidden/>
           </w:rPr>
-          <w:instrText xml:space="preserve"> PAGEREF _Toc243489815 \h </w:instrText>
+          <w:instrText xml:space="preserve"> PAGEREF _Toc243490367 \h </w:instrText>
         </w:r>
         <w:r>
           <w:rPr>
@@ -1683,7 +1683,7 @@
           <w:noProof/>
         </w:rPr>
       </w:pPr>
-      <w:hyperlink w:anchor="_Toc243489816" w:history="1">
+      <w:hyperlink w:anchor="_Toc243490368" w:history="1">
         <w:r>
           <w:rPr>
             <w:rStyle w:val="Hyperlink"/>
@@ -1710,7 +1710,7 @@
             <w:noProof/>
             <w:webHidden/>
           </w:rPr>
-          <w:instrText xml:space="preserve"> PAGEREF _Toc243489816 \h </w:instrText>
+          <w:instrText xml:space="preserve"> PAGEREF _Toc243490368 \h </w:instrText>
         </w:r>
         <w:r>
           <w:rPr>
@@ -1751,7 +1751,7 @@
           <w:noProof/>
         </w:rPr>
       </w:pPr>
-      <w:hyperlink w:anchor="_Toc243489817" w:history="1">
+      <w:hyperlink w:anchor="_Toc243490369" w:history="1">
         <w:r>
           <w:rPr>
             <w:rStyle w:val="Hyperlink"/>
@@ -1778,7 +1778,7 @@
             <w:noProof/>
             <w:webHidden/>
           </w:rPr>
-          <w:instrText xml:space="preserve"> PAGEREF _Toc243489817 \h </w:instrText>
+          <w:instrText xml:space="preserve"> PAGEREF _Toc243490369 \h </w:instrText>
         </w:r>
         <w:r>
           <w:rPr>
@@ -1819,7 +1819,7 @@
           <w:noProof/>
         </w:rPr>
       </w:pPr>
-      <w:hyperlink w:anchor="_Toc243489818" w:history="1">
+      <w:hyperlink w:anchor="_Toc243490370" w:history="1">
         <w:r>
           <w:rPr>
             <w:rStyle w:val="Hyperlink"/>
@@ -1846,7 +1846,7 @@
             <w:noProof/>
             <w:webHidden/>
           </w:rPr>
-          <w:instrText xml:space="preserve"> PAGEREF _Toc243489818 \h </w:instrText>
+          <w:instrText xml:space="preserve"> PAGEREF _Toc243490370 \h </w:instrText>
         </w:r>
         <w:r>
           <w:rPr>
@@ -1887,13 +1887,13 @@
           <w:noProof/>
         </w:rPr>
       </w:pPr>
-      <w:hyperlink w:anchor="_Toc243489819" w:history="1">
+      <w:hyperlink w:anchor="_Toc243490371" w:history="1">
         <w:r>
           <w:rPr>
             <w:rStyle w:val="Hyperlink"/>
             <w:noProof/>
           </w:rPr>
-          <w:t>6. IMPLEMENTATION EVIDENCE (AS AT 12 OCTOBER 2026)</w:t>
+          <w:t>6. IMPLEMENTATION EVIDENCE (AS AT 21 OCTOBER 2026)</w:t>
         </w:r>
         <w:r>
           <w:rPr>
@@ -1914,7 +1914,7 @@
             <w:noProof/>
             <w:webHidden/>
           </w:rPr>
-          <w:instrText xml:space="preserve"> PAGEREF _Toc243489819 \h </w:instrText>
+          <w:instrText xml:space="preserve"> PAGEREF _Toc243490371 \h </w:instrText>
         </w:r>
         <w:r>
           <w:rPr>
@@ -1955,7 +1955,7 @@
           <w:noProof/>
         </w:rPr>
       </w:pPr>
-      <w:hyperlink w:anchor="_Toc243489820" w:history="1">
+      <w:hyperlink w:anchor="_Toc243490372" w:history="1">
         <w:r>
           <w:rPr>
             <w:rStyle w:val="Hyperlink"/>
@@ -1982,7 +1982,7 @@
             <w:noProof/>
             <w:webHidden/>
           </w:rPr>
-          <w:instrText xml:space="preserve"> PAGEREF _Toc243489820 \h </w:instrText>
+          <w:instrText xml:space="preserve"> PAGEREF _Toc243490372 \h </w:instrText>
         </w:r>
         <w:r>
           <w:rPr>
@@ -2023,7 +2023,7 @@
           <w:noProof/>
         </w:rPr>
       </w:pPr>
-      <w:hyperlink w:anchor="_Toc243489821" w:history="1">
+      <w:hyperlink w:anchor="_Toc243490373" w:history="1">
         <w:r>
           <w:rPr>
             <w:rStyle w:val="Hyperlink"/>
@@ -2050,7 +2050,7 @@
             <w:noProof/>
             <w:webHidden/>
           </w:rPr>
-          <w:instrText xml:space="preserve"> PAGEREF _Toc243489821 \h </w:instrText>
+          <w:instrText xml:space="preserve"> PAGEREF _Toc243490373 \h </w:instrText>
         </w:r>
         <w:r>
           <w:rPr>
@@ -2091,7 +2091,7 @@
           <w:noProof/>
         </w:rPr>
       </w:pPr>
-      <w:hyperlink w:anchor="_Toc243489822" w:history="1">
+      <w:hyperlink w:anchor="_Toc243490374" w:history="1">
         <w:r>
           <w:rPr>
             <w:rStyle w:val="Hyperlink"/>
@@ -2118,7 +2118,7 @@
             <w:noProof/>
             <w:webHidden/>
           </w:rPr>
-          <w:instrText xml:space="preserve"> PAGEREF _Toc243489822 \h </w:instrText>
+          <w:instrText xml:space="preserve"> PAGEREF _Toc243490374 \h </w:instrText>
         </w:r>
         <w:r>
           <w:rPr>
@@ -2159,7 +2159,7 @@
           <w:noProof/>
         </w:rPr>
       </w:pPr>
-      <w:hyperlink w:anchor="_Toc243489823" w:history="1">
+      <w:hyperlink w:anchor="_Toc243490375" w:history="1">
         <w:r>
           <w:rPr>
             <w:rStyle w:val="Hyperlink"/>
@@ -2186,7 +2186,7 @@
             <w:noProof/>
             <w:webHidden/>
           </w:rPr>
-          <w:instrText xml:space="preserve"> PAGEREF _Toc243489823 \h </w:instrText>
+          <w:instrText xml:space="preserve"> PAGEREF _Toc243490375 \h </w:instrText>
         </w:r>
         <w:r>
           <w:rPr>
@@ -2227,7 +2227,7 @@
           <w:noProof/>
         </w:rPr>
       </w:pPr>
-      <w:hyperlink w:anchor="_Toc243489824" w:history="1">
+      <w:hyperlink w:anchor="_Toc243490376" w:history="1">
         <w:r>
           <w:rPr>
             <w:rStyle w:val="Hyperlink"/>
@@ -2254,7 +2254,7 @@
             <w:noProof/>
             <w:webHidden/>
           </w:rPr>
-          <w:instrText xml:space="preserve"> PAGEREF _Toc243489824 \h </w:instrText>
+          <w:instrText xml:space="preserve"> PAGEREF _Toc243490376 \h </w:instrText>
         </w:r>
         <w:r>
           <w:rPr>
@@ -2295,7 +2295,7 @@
           <w:noProof/>
         </w:rPr>
       </w:pPr>
-      <w:hyperlink w:anchor="_Toc243489825" w:history="1">
+      <w:hyperlink w:anchor="_Toc243490377" w:history="1">
         <w:r>
           <w:rPr>
             <w:rStyle w:val="Hyperlink"/>
@@ -2322,7 +2322,7 @@
             <w:noProof/>
             <w:webHidden/>
           </w:rPr>
-          <w:instrText xml:space="preserve"> PAGEREF _Toc243489825 \h </w:instrText>
+          <w:instrText xml:space="preserve"> PAGEREF _Toc243490377 \h </w:instrText>
         </w:r>
         <w:r>
           <w:rPr>
@@ -2363,7 +2363,7 @@
           <w:noProof/>
         </w:rPr>
       </w:pPr>
-      <w:hyperlink w:anchor="_Toc243489826" w:history="1">
+      <w:hyperlink w:anchor="_Toc243490378" w:history="1">
         <w:r>
           <w:rPr>
             <w:rStyle w:val="Hyperlink"/>
@@ -2390,7 +2390,7 @@
             <w:noProof/>
             <w:webHidden/>
           </w:rPr>
-          <w:instrText xml:space="preserve"> PAGEREF _Toc243489826 \h </w:instrText>
+          <w:instrText xml:space="preserve"> PAGEREF _Toc243490378 \h </w:instrText>
         </w:r>
         <w:r>
           <w:rPr>
@@ -2431,7 +2431,7 @@
           <w:noProof/>
         </w:rPr>
       </w:pPr>
-      <w:hyperlink w:anchor="_Toc243489827" w:history="1">
+      <w:hyperlink w:anchor="_Toc243490379" w:history="1">
         <w:r>
           <w:rPr>
             <w:rStyle w:val="Hyperlink"/>
@@ -2458,7 +2458,7 @@
             <w:noProof/>
             <w:webHidden/>
           </w:rPr>
-          <w:instrText xml:space="preserve"> PAGEREF _Toc243489827 \h </w:instrText>
+          <w:instrText xml:space="preserve"> PAGEREF _Toc243490379 \h </w:instrText>
         </w:r>
         <w:r>
           <w:rPr>
@@ -2499,7 +2499,7 @@
           <w:noProof/>
         </w:rPr>
       </w:pPr>
-      <w:hyperlink w:anchor="_Toc243489828" w:history="1">
+      <w:hyperlink w:anchor="_Toc243490380" w:history="1">
         <w:r>
           <w:rPr>
             <w:rStyle w:val="Hyperlink"/>
@@ -2526,7 +2526,7 @@
             <w:noProof/>
             <w:webHidden/>
           </w:rPr>
-          <w:instrText xml:space="preserve"> PAGEREF _Toc243489828 \h </w:instrText>
+          <w:instrText xml:space="preserve"> PAGEREF _Toc243490380 \h </w:instrText>
         </w:r>
         <w:r>
           <w:rPr>
@@ -2567,7 +2567,7 @@
           <w:noProof/>
         </w:rPr>
       </w:pPr>
-      <w:hyperlink w:anchor="_Toc243489829" w:history="1">
+      <w:hyperlink w:anchor="_Toc243490381" w:history="1">
         <w:r>
           <w:rPr>
             <w:rStyle w:val="Hyperlink"/>
@@ -2594,7 +2594,7 @@
             <w:noProof/>
             <w:webHidden/>
           </w:rPr>
-          <w:instrText xml:space="preserve"> PAGEREF _Toc243489829 \h </w:instrText>
+          <w:instrText xml:space="preserve"> PAGEREF _Toc243490381 \h </w:instrText>
         </w:r>
         <w:r>
           <w:rPr>
@@ -2639,7 +2639,7 @@
       <w:pPr>
         <w:pStyle w:val="Heading1"/>
       </w:pPr>
-      <w:bookmarkStart w:id="1" w:name="_Toc243489802"/>
+      <w:bookmarkStart w:id="1" w:name="_Toc243490354"/>
       <w:r>
         <w:lastRenderedPageBreak/>
         <w:t>1. INTRODUCTION</w:t>
@@ -2650,7 +2650,7 @@
       <w:pPr>
         <w:pStyle w:val="Heading2"/>
       </w:pPr>
-      <w:bookmarkStart w:id="2" w:name="_Toc243489803"/>
+      <w:bookmarkStart w:id="2" w:name="_Toc243490355"/>
       <w:r>
         <w:t>1.1 Background</w:t>
       </w:r>
@@ -2668,7 +2668,7 @@
       <w:pPr>
         <w:pStyle w:val="Heading2"/>
       </w:pPr>
-      <w:bookmarkStart w:id="3" w:name="_Toc243489804"/>
+      <w:bookmarkStart w:id="3" w:name="_Toc243490356"/>
       <w:r>
         <w:t>1.2 Objectives of the collaboration</w:t>
       </w:r>
@@ -2714,7 +2714,7 @@
       <w:pPr>
         <w:pStyle w:val="Heading2"/>
       </w:pPr>
-      <w:bookmarkStart w:id="4" w:name="_Toc243489805"/>
+      <w:bookmarkStart w:id="4" w:name="_Toc243490357"/>
       <w:r>
         <w:t>1.3 Scope and compliance</w:t>
       </w:r>
@@ -2729,7 +2729,7 @@
       <w:pPr>
         <w:pStyle w:val="Heading2"/>
       </w:pPr>
-      <w:bookmarkStart w:id="5" w:name="_Toc243489806"/>
+      <w:bookmarkStart w:id="5" w:name="_Toc243490358"/>
       <w:r>
         <w:t>1.4 Documentation map against the CGCT Model 1 checklist</w:t>
       </w:r>
@@ -2894,7 +2894,7 @@
               <w:rPr>
                 <w:sz w:val="19"/>
               </w:rPr>
-              <w:t>Section 6 (usage evidence as at 12 October 2026); Appendix A (Figures 3–7, 9); roster and submissions monitoring screenshots.</w:t>
+              <w:t>Section 6 (usage evidence as at 21 October 2026); Appendix A (Figures 3–7, 9); roster and submissions monitoring screenshots.</w:t>
             </w:r>
           </w:p>
         </w:tc>
@@ -2914,7 +2914,7 @@
       <w:pPr>
         <w:pStyle w:val="Heading1"/>
       </w:pPr>
-      <w:bookmarkStart w:id="6" w:name="_Toc243489807"/>
+      <w:bookmarkStart w:id="6" w:name="_Toc243490359"/>
       <w:r>
         <w:t>2. COURSE AND PROGRAMME INFORMATION</w:t>
       </w:r>
@@ -3442,7 +3442,7 @@
       <w:pPr>
         <w:pStyle w:val="Heading1"/>
       </w:pPr>
-      <w:bookmarkStart w:id="7" w:name="_Toc243489808"/>
+      <w:bookmarkStart w:id="7" w:name="_Toc243490360"/>
       <w:r>
         <w:t>3. COLLABORATION STRUCTURE AND ROLES</w:t>
       </w:r>
@@ -3697,7 +3697,7 @@
       <w:pPr>
         <w:pStyle w:val="Heading1"/>
       </w:pPr>
-      <w:bookmarkStart w:id="8" w:name="_Toc243489809"/>
+      <w:bookmarkStart w:id="8" w:name="_Toc243490361"/>
       <w:r>
         <w:t>4. DEVELOPED CONTENT — MEQ545 ALL-QUIZ TUTORIAL PORTAL</w:t>
       </w:r>
@@ -3707,7 +3707,7 @@
       <w:pPr>
         <w:pStyle w:val="Heading2"/>
       </w:pPr>
-      <w:bookmarkStart w:id="9" w:name="_Toc243489810"/>
+      <w:bookmarkStart w:id="9" w:name="_Toc243490362"/>
       <w:r>
         <w:t>4.1 Overview</w:t>
       </w:r>
@@ -3768,9 +3768,9 @@
       <w:pPr>
         <w:pStyle w:val="Heading2"/>
       </w:pPr>
-      <w:bookmarkStart w:id="10" w:name="_Toc243489811"/>
+      <w:bookmarkStart w:id="10" w:name="_Toc243490363"/>
       <w:r>
-        <w:t>4.2 Content matrix (10 tutorial sets / 107 questions)</w:t>
+        <w:t>4.2 Content matrix (10 tutorial sets / 114 questions)</w:t>
       </w:r>
       <w:bookmarkEnd w:id="10"/>
     </w:p>
@@ -3880,7 +3880,7 @@
                 <w:b/>
                 <w:sz w:val="18"/>
               </w:rPr>
-              <w:t>Status (12 Oct 2026)</w:t>
+              <w:t>Status (21 Oct 2026)</w:t>
             </w:r>
           </w:p>
         </w:tc>
@@ -3983,7 +3983,7 @@
               <w:rPr>
                 <w:sz w:val="18"/>
               </w:rPr>
-              <w:t>Active — completed by all students</w:t>
+              <w:t>Active — in use (27 submission records)</w:t>
             </w:r>
           </w:p>
         </w:tc>
@@ -4085,7 +4085,7 @@
               <w:rPr>
                 <w:sz w:val="18"/>
               </w:rPr>
-              <w:t>Active — completed by all students</w:t>
+              <w:t>Active — in use (24 submission records)</w:t>
             </w:r>
           </w:p>
         </w:tc>
@@ -4187,7 +4187,7 @@
               <w:rPr>
                 <w:sz w:val="18"/>
               </w:rPr>
-              <w:t>Developed; scheduled release (W4)</w:t>
+              <w:t>Active — released Week 4 (14 submission records)</w:t>
             </w:r>
           </w:p>
         </w:tc>
@@ -4273,7 +4273,7 @@
               <w:rPr>
                 <w:sz w:val="18"/>
               </w:rPr>
-              <w:t>10 MCQ</w:t>
+              <w:t>15 MCQ · 2 short</w:t>
             </w:r>
           </w:p>
         </w:tc>
@@ -4289,7 +4289,7 @@
               <w:rPr>
                 <w:sz w:val="18"/>
               </w:rPr>
-              <w:t>Developed; scheduled release (W4)</w:t>
+              <w:t>Active — released Week 4</w:t>
             </w:r>
           </w:p>
         </w:tc>
@@ -4987,7 +4987,7 @@
               <w:rPr>
                 <w:sz w:val="18"/>
               </w:rPr>
-              <w:t>107 questions (78 MCQ · 3 T/F · 24 short · 2 long)</w:t>
+              <w:t>114 questions (83 MCQ · 3 T/F · 26 short · 2 long)</w:t>
             </w:r>
           </w:p>
         </w:tc>
@@ -5017,7 +5017,7 @@
       <w:pPr>
         <w:pStyle w:val="Heading2"/>
       </w:pPr>
-      <w:bookmarkStart w:id="11" w:name="_Toc243489812"/>
+      <w:bookmarkStart w:id="11" w:name="_Toc243490364"/>
       <w:r>
         <w:t>4.3 Access</w:t>
       </w:r>
@@ -5065,7 +5065,7 @@
       <w:pPr>
         <w:pStyle w:val="Heading2"/>
       </w:pPr>
-      <w:bookmarkStart w:id="12" w:name="_Toc243489813"/>
+      <w:bookmarkStart w:id="12" w:name="_Toc243490365"/>
       <w:r>
         <w:t>4.4 Quality assurance</w:t>
       </w:r>
@@ -5080,7 +5080,7 @@
       <w:pPr>
         <w:pStyle w:val="Heading1"/>
       </w:pPr>
-      <w:bookmarkStart w:id="13" w:name="_Toc243489814"/>
+      <w:bookmarkStart w:id="13" w:name="_Toc243490366"/>
       <w:r>
         <w:lastRenderedPageBreak/>
         <w:t>5. COLLABORATION WORKFLOW AND ATTRIBUTION</w:t>
@@ -5091,7 +5091,7 @@
       <w:pPr>
         <w:pStyle w:val="Heading2"/>
       </w:pPr>
-      <w:bookmarkStart w:id="14" w:name="_Toc243489815"/>
+      <w:bookmarkStart w:id="14" w:name="_Toc243490367"/>
       <w:r>
         <w:t>5.1 Workflow</w:t>
       </w:r>
@@ -5146,7 +5146,7 @@
       <w:pPr>
         <w:pStyle w:val="Heading2"/>
       </w:pPr>
-      <w:bookmarkStart w:id="15" w:name="_Toc243489816"/>
+      <w:bookmarkStart w:id="15" w:name="_Toc243490368"/>
       <w:r>
         <w:t>5.2 Attribution</w:t>
       </w:r>
@@ -5391,7 +5391,7 @@
       <w:pPr>
         <w:pStyle w:val="Heading2"/>
       </w:pPr>
-      <w:bookmarkStart w:id="16" w:name="_Toc243489817"/>
+      <w:bookmarkStart w:id="16" w:name="_Toc243490369"/>
       <w:r>
         <w:t>5.3 Industry panel contribution</w:t>
       </w:r>
@@ -5442,7 +5442,7 @@
       <w:pPr>
         <w:pStyle w:val="Heading2"/>
       </w:pPr>
-      <w:bookmarkStart w:id="17" w:name="_Toc243489818"/>
+      <w:bookmarkStart w:id="17" w:name="_Toc243490370"/>
       <w:r>
         <w:t>5.4 Tuned teaching plan (checklist item (a))</w:t>
       </w:r>
@@ -5464,9 +5464,9 @@
       <w:pPr>
         <w:pStyle w:val="Heading1"/>
       </w:pPr>
-      <w:bookmarkStart w:id="18" w:name="_Toc243489819"/>
+      <w:bookmarkStart w:id="18" w:name="_Toc243490371"/>
       <w:r>
-        <w:t>6. IMPLEMENTATION EVIDENCE (AS AT 12 OCTOBER 2026)</w:t>
+        <w:t>6. IMPLEMENTATION EVIDENCE (AS AT 21 OCTOBER 2026)</w:t>
       </w:r>
       <w:bookmarkEnd w:id="18"/>
     </w:p>
@@ -5474,7 +5474,7 @@
       <w:pPr>
         <w:pStyle w:val="Heading2"/>
       </w:pPr>
-      <w:bookmarkStart w:id="19" w:name="_Toc243489820"/>
+      <w:bookmarkStart w:id="19" w:name="_Toc243490372"/>
       <w:r>
         <w:t>6.1 Usage metrics</w:t>
       </w:r>
@@ -5566,7 +5566,7 @@
               <w:rPr>
                 <w:sz w:val="19"/>
               </w:rPr>
-              <w:t>17</w:t>
+              <w:t>24</w:t>
             </w:r>
           </w:p>
         </w:tc>
@@ -5604,7 +5604,7 @@
               <w:rPr>
                 <w:sz w:val="19"/>
               </w:rPr>
-              <w:t>2 (Tutorial 1 and Tutorial 2)</w:t>
+              <w:t>4 (Tutorials 1–4)</w:t>
             </w:r>
           </w:p>
         </w:tc>
@@ -5626,7 +5626,7 @@
                 <w:b/>
                 <w:sz w:val="19"/>
               </w:rPr>
-              <w:t>Questions deployed (of 107 developed)</w:t>
+              <w:t>Questions deployed (of 114 developed)</w:t>
             </w:r>
           </w:p>
         </w:tc>
@@ -5642,7 +5642,7 @@
               <w:rPr>
                 <w:sz w:val="19"/>
               </w:rPr>
-              <w:t>22</w:t>
+              <w:t>49</w:t>
             </w:r>
           </w:p>
         </w:tc>
@@ -5680,7 +5680,7 @@
               <w:rPr>
                 <w:sz w:val="19"/>
               </w:rPr>
-              <w:t>42 (21 for Tutorial 1; 21 for Tutorial 2 — includes re-sits)</w:t>
+              <w:t>65 (Tutorial 1: 27 · Tutorial 2: 24 · Tutorial 3: 14)</w:t>
             </w:r>
           </w:p>
         </w:tc>
@@ -5718,7 +5718,7 @@
               <w:rPr>
                 <w:sz w:val="19"/>
               </w:rPr>
-              <w:t>34 student–tutorial completions; all 17 registered students completed both active sets</w:t>
+              <w:t>51 student–tutorial completions across Tutorials 1–3</w:t>
             </w:r>
           </w:p>
         </w:tc>
@@ -5756,7 +5756,7 @@
               <w:rPr>
                 <w:sz w:val="19"/>
               </w:rPr>
-              <w:t>58</w:t>
+              <w:t>90</w:t>
             </w:r>
           </w:p>
         </w:tc>
@@ -5794,7 +5794,7 @@
               <w:rPr>
                 <w:sz w:val="19"/>
               </w:rPr>
-              <w:t>74.3% (7.4 / 10)</w:t>
+              <w:t>74.8%</w:t>
             </w:r>
           </w:p>
         </w:tc>
@@ -5832,7 +5832,45 @@
               <w:rPr>
                 <w:sz w:val="19"/>
               </w:rPr>
-              <w:t>77.9% (9.3 / 12)</w:t>
+              <w:t>73.4%</w:t>
+            </w:r>
+          </w:p>
+        </w:tc>
+      </w:tr>
+      <w:tr>
+        <w:trPr>
+          <w:jc w:val="center"/>
+        </w:trPr>
+        <w:tc>
+          <w:tcPr>
+            <w:tcW w:w="4082" w:type="dxa"/>
+          </w:tcPr>
+          <w:p>
+            <w:pPr>
+              <w:spacing w:after="40"/>
+            </w:pPr>
+            <w:r>
+              <w:rPr>
+                <w:b/>
+                <w:sz w:val="19"/>
+              </w:rPr>
+              <w:t>Average score — Tutorial 3</w:t>
+            </w:r>
+          </w:p>
+        </w:tc>
+        <w:tc>
+          <w:tcPr>
+            <w:tcW w:w="4989" w:type="dxa"/>
+          </w:tcPr>
+          <w:p>
+            <w:pPr>
+              <w:spacing w:after="40"/>
+            </w:pPr>
+            <w:r>
+              <w:rPr>
+                <w:sz w:val="19"/>
+              </w:rPr>
+              <w:t>83.6%</w:t>
             </w:r>
           </w:p>
         </w:tc>
@@ -5870,7 +5908,7 @@
               <w:rPr>
                 <w:sz w:val="19"/>
               </w:rPr>
-              <w:t>100% on both sets</w:t>
+              <w:t>100% on Tutorials 1–3</w:t>
             </w:r>
           </w:p>
         </w:tc>
@@ -5890,7 +5928,7 @@
       <w:pPr>
         <w:pStyle w:val="Heading2"/>
       </w:pPr>
-      <w:bookmarkStart w:id="20" w:name="_Toc243489821"/>
+      <w:bookmarkStart w:id="20" w:name="_Toc243490373"/>
       <w:r>
         <w:t>6.2 Evidence of sessions conducted with students and content (checklist item (c))</w:t>
       </w:r>
@@ -5898,7 +5936,7 @@
     </w:p>
     <w:p>
       <w:r>
-        <w:t xml:space="preserve">Figure 3 shows a live student session: the student is signed in and the portal lists the available tutorial sets with per-student completion badges. Figure 6 shows the roster of all 17 registered students, and Figure 7 shows the staff view of submissions with per-student scores and attendance ticks. Figure 4 shows the attendance e-signature pad presented before a tutorial starts. Figure 8 shows the student question view with a worked explanation, and Figure 9 shows the signed attendance record generated by </w:t>
+        <w:t xml:space="preserve">Figure 3 shows a live student session: the student is signed in and the portal lists the available tutorial sets with per-student completion badges. Figure 6 shows the roster of all 24 registered students, and Figure 7 shows the staff view of submissions with per-student scores and attendance ticks. Figure 4 shows the attendance e-signature pad presented before a tutorial starts. Figure 8 shows the student question view with a worked explanation, and Figure 9 shows the signed attendance record generated by </w:t>
       </w:r>
       <w:r>
         <w:t>the portal, in which each student's captured e-signature is printed against the tutorial date.</w:t>
@@ -5908,7 +5946,7 @@
       <w:pPr>
         <w:pStyle w:val="Heading2"/>
       </w:pPr>
-      <w:bookmarkStart w:id="21" w:name="_Toc243489822"/>
+      <w:bookmarkStart w:id="21" w:name="_Toc243490374"/>
       <w:r>
         <w:t>6.3 Notes on interpretation</w:t>
       </w:r>
@@ -5916,14 +5954,14 @@
     </w:p>
     <w:p>
       <w:r>
-        <w:t>Submission record counts (42) exceed unique completions (34) because students may re-sit a tutorial (the portal retains every attempt). Attendance signatures (58) are captured at each tutorial start, including repeat attempts, and serve as the digital equivalent of the tutorial attendance list.</w:t>
+        <w:t>Submission record counts (65) exceed unique completions (51) because students may re-sit a tutorial (the portal retains every attempt). Attendance signatures (90) are captured at each tutorial start, including repeat attempts, and serve as the digital equivalent of the tutorial attendance list.</w:t>
       </w:r>
     </w:p>
     <w:p>
       <w:pPr>
         <w:pStyle w:val="Heading1"/>
       </w:pPr>
-      <w:bookmarkStart w:id="22" w:name="_Toc243489823"/>
+      <w:bookmarkStart w:id="22" w:name="_Toc243490375"/>
       <w:r>
         <w:t>7. REFLECTION AND CONTINUATION PLAN</w:t>
       </w:r>
@@ -5933,7 +5971,7 @@
       <w:pPr>
         <w:pStyle w:val="Heading2"/>
       </w:pPr>
-      <w:bookmarkStart w:id="23" w:name="_Toc243489824"/>
+      <w:bookmarkStart w:id="23" w:name="_Toc243490376"/>
       <w:r>
         <w:t>7.1 Outcomes</w:t>
       </w:r>
@@ -5941,14 +5979,14 @@
     </w:p>
     <w:p>
       <w:r>
-        <w:t>Adoption of the developed content was immediate: all 17 registered students completed both active sets within the first three weeks of the semester. Attendance is now captured digitally with signatures stored per session, objective items are marked automatically, and students receive instant answer explanations — freeing tutorial time for discussion.</w:t>
+        <w:t>Adoption of the developed content has been strong: by Week 4 the portal had recorded 27 submissions (20 unique students) for Tutorial 1, 24 (19 unique students) for Tutorial 2 and 14 (12 unique students) for Tutorial 3, with average scores of 74.8%, 73.4% and 83.6% respectively. Attendance is captured digitally with signatures stored per session, objective items are marked automatically, and students receive instant answer explanations — freeing tutorial time for discussion.</w:t>
       </w:r>
     </w:p>
     <w:p>
       <w:pPr>
         <w:pStyle w:val="Heading2"/>
       </w:pPr>
-      <w:bookmarkStart w:id="24" w:name="_Toc243489825"/>
+      <w:bookmarkStart w:id="24" w:name="_Toc243490377"/>
       <w:r>
         <w:t>7.2 Observations and improvements</w:t>
       </w:r>
@@ -5978,6 +6016,7 @@
         <w:spacing w:after="60"/>
       </w:pPr>
       <w:r>
+        <w:lastRenderedPageBreak/>
         <w:t>Network conditions during class are manageable: the portal is lightweight and works on student data plans.</w:t>
       </w:r>
     </w:p>
@@ -5985,9 +6024,8 @@
       <w:pPr>
         <w:pStyle w:val="Heading2"/>
       </w:pPr>
-      <w:bookmarkStart w:id="25" w:name="_Toc243489826"/>
+      <w:bookmarkStart w:id="25" w:name="_Toc243490378"/>
       <w:r>
-        <w:lastRenderedPageBreak/>
         <w:t>7.3 Continuation plan</w:t>
       </w:r>
       <w:bookmarkEnd w:id="25"/>
@@ -6032,7 +6070,7 @@
       <w:pPr>
         <w:pStyle w:val="Heading2"/>
       </w:pPr>
-      <w:bookmarkStart w:id="26" w:name="_Toc243489827"/>
+      <w:bookmarkStart w:id="26" w:name="_Toc243490379"/>
       <w:r>
         <w:t>7.4 Links</w:t>
       </w:r>
@@ -6286,7 +6324,7 @@
       <w:pPr>
         <w:pStyle w:val="Heading1"/>
       </w:pPr>
-      <w:bookmarkStart w:id="27" w:name="_Toc243489828"/>
+      <w:bookmarkStart w:id="27" w:name="_Toc243490380"/>
       <w:r>
         <w:lastRenderedPageBreak/>
         <w:t>APPENDIX A — EVIDENCE: SCREEN CAPTURES</w:t>
@@ -6313,7 +6351,7 @@
           <w:noProof/>
         </w:rPr>
         <w:drawing>
-          <wp:inline distT="0" distB="0" distL="0" distR="0" wp14:anchorId="2FD74ADB" wp14:editId="715F721F">
+          <wp:inline distT="0" distB="0" distL="0" distR="0" wp14:anchorId="5F28DDBD" wp14:editId="3DCF93EC">
             <wp:extent cx="5580000" cy="3487500"/>
             <wp:effectExtent l="0" t="0" r="0" b="0"/>
             <wp:docPr id="4" name="Picture 4"/>
@@ -6379,7 +6417,7 @@
         </w:rPr>
         <w:lastRenderedPageBreak/>
         <w:drawing>
-          <wp:inline distT="0" distB="0" distL="0" distR="0" wp14:anchorId="75AA02CC" wp14:editId="163A4FE9">
+          <wp:inline distT="0" distB="0" distL="0" distR="0" wp14:anchorId="5F6A8CAA" wp14:editId="15A33DFC">
             <wp:extent cx="5580000" cy="3487500"/>
             <wp:effectExtent l="0" t="0" r="0" b="0"/>
             <wp:docPr id="5" name="Picture 5"/>
@@ -6445,7 +6483,7 @@
         </w:rPr>
         <w:lastRenderedPageBreak/>
         <w:drawing>
-          <wp:inline distT="0" distB="0" distL="0" distR="0" wp14:anchorId="5618649A" wp14:editId="00D84250">
+          <wp:inline distT="0" distB="0" distL="0" distR="0" wp14:anchorId="328DB96D" wp14:editId="020F4C04">
             <wp:extent cx="5580000" cy="3487500"/>
             <wp:effectExtent l="0" t="0" r="0" b="0"/>
             <wp:docPr id="6" name="Picture 6"/>
@@ -6511,7 +6549,7 @@
         </w:rPr>
         <w:lastRenderedPageBreak/>
         <w:drawing>
-          <wp:inline distT="0" distB="0" distL="0" distR="0" wp14:anchorId="0374ACCA" wp14:editId="2E157DED">
+          <wp:inline distT="0" distB="0" distL="0" distR="0" wp14:anchorId="1FE3D886" wp14:editId="02F64076">
             <wp:extent cx="5580000" cy="3487500"/>
             <wp:effectExtent l="0" t="0" r="0" b="0"/>
             <wp:docPr id="7" name="Picture 7"/>
@@ -6577,7 +6615,7 @@
         </w:rPr>
         <w:lastRenderedPageBreak/>
         <w:drawing>
-          <wp:inline distT="0" distB="0" distL="0" distR="0" wp14:anchorId="098CC972" wp14:editId="7918D485">
+          <wp:inline distT="0" distB="0" distL="0" distR="0" wp14:anchorId="3C13A6B0" wp14:editId="58EE9424">
             <wp:extent cx="5580000" cy="4603500"/>
             <wp:effectExtent l="0" t="0" r="0" b="0"/>
             <wp:docPr id="8" name="Picture 8"/>
@@ -6643,8 +6681,8 @@
         </w:rPr>
         <w:lastRenderedPageBreak/>
         <w:drawing>
-          <wp:inline distT="0" distB="0" distL="0" distR="0" wp14:anchorId="489DDA0E" wp14:editId="6AC32453">
-            <wp:extent cx="5580000" cy="5771167"/>
+          <wp:inline distT="0" distB="0" distL="0" distR="0" wp14:anchorId="53B610A1" wp14:editId="0AA8CB61">
+            <wp:extent cx="5580000" cy="6665000"/>
             <wp:effectExtent l="0" t="0" r="0" b="0"/>
             <wp:docPr id="9" name="Picture 9"/>
             <wp:cNvGraphicFramePr>
@@ -6666,7 +6704,7 @@
                   <pic:spPr>
                     <a:xfrm>
                       <a:off x="0" y="0"/>
-                      <a:ext cx="5580000" cy="5771167"/>
+                      <a:ext cx="5580000" cy="6665000"/>
                     </a:xfrm>
                     <a:prstGeom prst="rect">
                       <a:avLst/>
@@ -6690,7 +6728,7 @@
           <w:color w:val="595959"/>
           <w:sz w:val="17"/>
         </w:rPr>
-        <w:t>Figure 6 — Registered students of class PEM2433A1 (17 of 17) with submission counts.</w:t>
+        <w:t>Figure 6 — Registered students of class PEM2433A1 (24 of 24) with submission counts.</w:t>
       </w:r>
     </w:p>
     <w:p>
@@ -6709,7 +6747,7 @@
         </w:rPr>
         <w:lastRenderedPageBreak/>
         <w:drawing>
-          <wp:inline distT="0" distB="0" distL="0" distR="0" wp14:anchorId="5B556ACE" wp14:editId="76EF34D4">
+          <wp:inline distT="0" distB="0" distL="0" distR="0" wp14:anchorId="088F0861" wp14:editId="7241374B">
             <wp:extent cx="5580000" cy="3487500"/>
             <wp:effectExtent l="0" t="0" r="0" b="0"/>
             <wp:docPr id="10" name="Picture 10"/>
@@ -6775,7 +6813,7 @@
         </w:rPr>
         <w:lastRenderedPageBreak/>
         <w:drawing>
-          <wp:inline distT="0" distB="0" distL="0" distR="0" wp14:anchorId="51CA9A9B" wp14:editId="649A143B">
+          <wp:inline distT="0" distB="0" distL="0" distR="0" wp14:anchorId="4AF33214" wp14:editId="6ED51097">
             <wp:extent cx="5580000" cy="3487500"/>
             <wp:effectExtent l="0" t="0" r="0" b="0"/>
             <wp:docPr id="11" name="Picture 11"/>
@@ -6841,8 +6879,8 @@
         </w:rPr>
         <w:lastRenderedPageBreak/>
         <w:drawing>
-          <wp:inline distT="0" distB="0" distL="0" distR="0" wp14:anchorId="0607192B" wp14:editId="595D3227">
-            <wp:extent cx="4960837" cy="6767999"/>
+          <wp:inline distT="0" distB="0" distL="0" distR="0" wp14:anchorId="7EEA5D33" wp14:editId="0006608C">
+            <wp:extent cx="4784059" cy="6767999"/>
             <wp:effectExtent l="0" t="0" r="0" b="0"/>
             <wp:docPr id="12" name="Picture 12"/>
             <wp:cNvGraphicFramePr>
@@ -6864,7 +6902,7 @@
                   <pic:spPr>
                     <a:xfrm>
                       <a:off x="0" y="0"/>
-                      <a:ext cx="4960837" cy="6767999"/>
+                      <a:ext cx="4784059" cy="6767999"/>
                     </a:xfrm>
                     <a:prstGeom prst="rect">
                       <a:avLst/>
@@ -6888,7 +6926,7 @@
           <w:color w:val="595959"/>
           <w:sz w:val="17"/>
         </w:rPr>
-        <w:t>Figure 9 — Signed attendance record generated by the portal ('Attendance PDF' export, official HEA/RP/KH-01 format): detail of the tutorial columns, where each student's captured e-signature is printed under the tutorial date. The full signed PDF is supplied in the evidence folder.</w:t>
+        <w:t>Figure 9 — Signed attendance record exactly as exported by the portal ('Attendance PDF' in the official HEA/RP/KH-01 format): page 1 shows the student roster (names and IDs) and each student's captured e-signature under the tutorial date. The full multi-page PDF is supplied in the evidence folder.</w:t>
       </w:r>
     </w:p>
     <w:p>
@@ -6907,7 +6945,7 @@
         </w:rPr>
         <w:lastRenderedPageBreak/>
         <w:drawing>
-          <wp:inline distT="0" distB="0" distL="0" distR="0" wp14:anchorId="6759F076" wp14:editId="006AC719">
+          <wp:inline distT="0" distB="0" distL="0" distR="0" wp14:anchorId="0FB28772" wp14:editId="4F02D6D0">
             <wp:extent cx="5580000" cy="3487500"/>
             <wp:effectExtent l="0" t="0" r="0" b="0"/>
             <wp:docPr id="13" name="Picture 13"/>
@@ -6973,7 +7011,7 @@
         </w:rPr>
         <w:lastRenderedPageBreak/>
         <w:drawing>
-          <wp:inline distT="0" distB="0" distL="0" distR="0" wp14:anchorId="1B64B099" wp14:editId="00D79F00">
+          <wp:inline distT="0" distB="0" distL="0" distR="0" wp14:anchorId="3AF7CC1D" wp14:editId="4F5E4109">
             <wp:extent cx="5580000" cy="3487500"/>
             <wp:effectExtent l="0" t="0" r="0" b="0"/>
             <wp:docPr id="14" name="Picture 14"/>
@@ -7032,7 +7070,7 @@
       <w:pPr>
         <w:pStyle w:val="Heading1"/>
       </w:pPr>
-      <w:bookmarkStart w:id="28" w:name="_Toc243489829"/>
+      <w:bookmarkStart w:id="28" w:name="_Toc243490381"/>
       <w:r>
         <w:lastRenderedPageBreak/>
         <w:t>APPENDIX B — INDUSTRY PANEL CURRICULUM VITAE</w:t>
@@ -7054,7 +7092,7 @@
           <w:noProof/>
         </w:rPr>
         <w:drawing>
-          <wp:inline distT="0" distB="0" distL="0" distR="0" wp14:anchorId="6AFB7191" wp14:editId="4B40B077">
+          <wp:inline distT="0" distB="0" distL="0" distR="0" wp14:anchorId="6DF1E190" wp14:editId="736755B5">
             <wp:extent cx="4963333" cy="7020000"/>
             <wp:effectExtent l="0" t="0" r="0" b="0"/>
             <wp:docPr id="15" name="Picture 15"/>
@@ -7413,31 +7451,31 @@
       </w:rPr>
     </w:lvl>
   </w:abstractNum>
-  <w:num w:numId="1" w16cid:durableId="1829520620">
+  <w:num w:numId="1" w16cid:durableId="322466180">
     <w:abstractNumId w:val="8"/>
   </w:num>
-  <w:num w:numId="2" w16cid:durableId="1964145676">
+  <w:num w:numId="2" w16cid:durableId="111487083">
     <w:abstractNumId w:val="6"/>
   </w:num>
-  <w:num w:numId="3" w16cid:durableId="711003889">
+  <w:num w:numId="3" w16cid:durableId="1313365086">
     <w:abstractNumId w:val="5"/>
   </w:num>
-  <w:num w:numId="4" w16cid:durableId="1253322662">
+  <w:num w:numId="4" w16cid:durableId="643898528">
     <w:abstractNumId w:val="4"/>
   </w:num>
-  <w:num w:numId="5" w16cid:durableId="1727021240">
+  <w:num w:numId="5" w16cid:durableId="1146118696">
     <w:abstractNumId w:val="7"/>
   </w:num>
-  <w:num w:numId="6" w16cid:durableId="1301374965">
+  <w:num w:numId="6" w16cid:durableId="815757178">
     <w:abstractNumId w:val="3"/>
   </w:num>
-  <w:num w:numId="7" w16cid:durableId="1622226416">
+  <w:num w:numId="7" w16cid:durableId="193736558">
     <w:abstractNumId w:val="2"/>
   </w:num>
-  <w:num w:numId="8" w16cid:durableId="1659460885">
+  <w:num w:numId="8" w16cid:durableId="1836142379">
     <w:abstractNumId w:val="1"/>
   </w:num>
-  <w:num w:numId="9" w16cid:durableId="1898928205">
+  <w:num w:numId="9" w16cid:durableId="1841500805">
     <w:abstractNumId w:val="0"/>
   </w:num>
 </w:numbering>
@@ -18831,7 +18869,7 @@
     <w:autoRedefine/>
     <w:uiPriority w:val="39"/>
     <w:unhideWhenUsed/>
-    <w:rsid w:val="00C96C93"/>
+    <w:rsid w:val="00D91390"/>
     <w:pPr>
       <w:spacing w:after="100"/>
     </w:pPr>
@@ -18843,7 +18881,7 @@
     <w:autoRedefine/>
     <w:uiPriority w:val="39"/>
     <w:unhideWhenUsed/>
-    <w:rsid w:val="00C96C93"/>
+    <w:rsid w:val="00D91390"/>
     <w:pPr>
       <w:spacing w:after="100"/>
       <w:ind w:left="210"/>
@@ -18854,7 +18892,7 @@
     <w:basedOn w:val="DefaultParagraphFont"/>
     <w:uiPriority w:val="99"/>
     <w:unhideWhenUsed/>
-    <w:rsid w:val="00C96C93"/>
+    <w:rsid w:val="00D91390"/>
     <w:rPr>
       <w:color w:val="0000FF" w:themeColor="hyperlink"/>
       <w:u w:val="single"/>

</xml_diff>